<commit_message>
Condo Assistant: update model with real client distribution + $500 enterprise flat rate (~$4.1M ARR)
Co-Authored-By: Claude Opus 4.8 <noreply@anthropic.com>
</commit_message>
<xml_diff>
--- a/project_files/Condo_Assistant_Business_Plan.docx
+++ b/project_files/Condo_Assistant_Business_Plan.docx
@@ -140,7 +140,7 @@
         <w:spacing w:after="120"/>
       </w:pPr>
       <w:r>
-        <w:t xml:space="preserve">This plan targets 5,000 VRBO clients. At full penetration the model produces roughly $4.7M in annual recurring revenue at a ~79% gross margin, with best-in-class unit economics (LTV:CAC ~13.8x). Below are the product, pricing, revenue model, unit economics, and three rollout options.</w:t>
+        <w:t xml:space="preserve">This plan targets ~5,050 VRBO clients. At full penetration the model produces roughly $4.1M in annual recurring revenue at a ~77% gross margin, with best-in-class unit economics (LTV:CAC ~11.6x). Below are the product, pricing, revenue model, unit economics, and three rollout options.</w:t>
       </w:r>
     </w:p>
     <w:p>
@@ -275,11 +275,11 @@
         </w:tblBorders>
       </w:tblPr>
       <w:tblGrid>
-        <w:gridCol w:w="2160"/>
         <w:gridCol w:w="1900"/>
         <w:gridCol w:w="1700"/>
-        <w:gridCol w:w="1900"/>
-        <w:gridCol w:w="1700"/>
+        <w:gridCol w:w="1500"/>
+        <w:gridCol w:w="1760"/>
+        <w:gridCol w:w="2500"/>
       </w:tblGrid>
       <w:tr>
         <w:trPr>
@@ -287,7 +287,7 @@
         </w:trPr>
         <w:tc>
           <w:tcPr>
-            <w:tcW w:type="dxa" w:w="2160"/>
+            <w:tcW w:type="dxa" w:w="1900"/>
             <w:shd w:fill="1F3864" w:val="clear"/>
             <w:tcMar>
               <w:top w:type="dxa" w:w="60"/>
@@ -311,7 +311,7 @@
         </w:tc>
         <w:tc>
           <w:tcPr>
-            <w:tcW w:type="dxa" w:w="1900"/>
+            <w:tcW w:type="dxa" w:w="1700"/>
             <w:shd w:fill="1F3864" w:val="clear"/>
             <w:tcMar>
               <w:top w:type="dxa" w:w="60"/>
@@ -335,7 +335,7 @@
         </w:tc>
         <w:tc>
           <w:tcPr>
-            <w:tcW w:type="dxa" w:w="1700"/>
+            <w:tcW w:type="dxa" w:w="1500"/>
             <w:shd w:fill="1F3864" w:val="clear"/>
             <w:tcMar>
               <w:top w:type="dxa" w:w="60"/>
@@ -359,7 +359,7 @@
         </w:tc>
         <w:tc>
           <w:tcPr>
-            <w:tcW w:type="dxa" w:w="1900"/>
+            <w:tcW w:type="dxa" w:w="1760"/>
             <w:shd w:fill="1F3864" w:val="clear"/>
             <w:tcMar>
               <w:top w:type="dxa" w:w="60"/>
@@ -383,7 +383,7 @@
         </w:tc>
         <w:tc>
           <w:tcPr>
-            <w:tcW w:type="dxa" w:w="1700"/>
+            <w:tcW w:type="dxa" w:w="2500"/>
             <w:shd w:fill="1F3864" w:val="clear"/>
             <w:tcMar>
               <w:top w:type="dxa" w:w="60"/>
@@ -401,7 +401,7 @@
                 <w:sz w:val="19"/>
                 <w:szCs w:val="19"/>
               </w:rPr>
-              <w:t xml:space="preserve">Bundle Discount</w:t>
+              <w:t xml:space="preserve">Notes</w:t>
             </w:r>
           </w:p>
         </w:tc>
@@ -409,7 +409,7 @@
       <w:tr>
         <w:tc>
           <w:tcPr>
-            <w:tcW w:type="dxa" w:w="2160"/>
+            <w:tcW w:type="dxa" w:w="1900"/>
             <w:tcMar>
               <w:top w:type="dxa" w:w="60"/>
               <w:left w:type="dxa" w:w="90"/>
@@ -431,7 +431,7 @@
         </w:tc>
         <w:tc>
           <w:tcPr>
-            <w:tcW w:type="dxa" w:w="1900"/>
+            <w:tcW w:type="dxa" w:w="1700"/>
             <w:tcMar>
               <w:top w:type="dxa" w:w="60"/>
               <w:left w:type="dxa" w:w="90"/>
@@ -453,7 +453,7 @@
         </w:tc>
         <w:tc>
           <w:tcPr>
-            <w:tcW w:type="dxa" w:w="1700"/>
+            <w:tcW w:type="dxa" w:w="1500"/>
             <w:tcMar>
               <w:top w:type="dxa" w:w="60"/>
               <w:left w:type="dxa" w:w="90"/>
@@ -475,7 +475,7 @@
         </w:tc>
         <w:tc>
           <w:tcPr>
-            <w:tcW w:type="dxa" w:w="1900"/>
+            <w:tcW w:type="dxa" w:w="1760"/>
             <w:tcMar>
               <w:top w:type="dxa" w:w="60"/>
               <w:left w:type="dxa" w:w="90"/>
@@ -497,7 +497,7 @@
         </w:tc>
         <w:tc>
           <w:tcPr>
-            <w:tcW w:type="dxa" w:w="1700"/>
+            <w:tcW w:type="dxa" w:w="2500"/>
             <w:tcMar>
               <w:top w:type="dxa" w:w="60"/>
               <w:left w:type="dxa" w:w="90"/>
@@ -521,7 +521,7 @@
       <w:tr>
         <w:tc>
           <w:tcPr>
-            <w:tcW w:type="dxa" w:w="2160"/>
+            <w:tcW w:type="dxa" w:w="1900"/>
             <w:shd w:fill="F2F6FC" w:val="clear"/>
             <w:tcMar>
               <w:top w:type="dxa" w:w="60"/>
@@ -544,7 +544,7 @@
         </w:tc>
         <w:tc>
           <w:tcPr>
-            <w:tcW w:type="dxa" w:w="1900"/>
+            <w:tcW w:type="dxa" w:w="1700"/>
             <w:shd w:fill="F2F6FC" w:val="clear"/>
             <w:tcMar>
               <w:top w:type="dxa" w:w="60"/>
@@ -567,7 +567,7 @@
         </w:tc>
         <w:tc>
           <w:tcPr>
-            <w:tcW w:type="dxa" w:w="1700"/>
+            <w:tcW w:type="dxa" w:w="1500"/>
             <w:shd w:fill="F2F6FC" w:val="clear"/>
             <w:tcMar>
               <w:top w:type="dxa" w:w="60"/>
@@ -590,7 +590,7 @@
         </w:tc>
         <w:tc>
           <w:tcPr>
-            <w:tcW w:type="dxa" w:w="1900"/>
+            <w:tcW w:type="dxa" w:w="1760"/>
             <w:shd w:fill="F2F6FC" w:val="clear"/>
             <w:tcMar>
               <w:top w:type="dxa" w:w="60"/>
@@ -613,24 +613,24 @@
         </w:tc>
         <w:tc>
           <w:tcPr>
-            <w:tcW w:type="dxa" w:w="1700"/>
-            <w:shd w:fill="F2F6FC" w:val="clear"/>
-            <w:tcMar>
-              <w:top w:type="dxa" w:w="60"/>
-              <w:left w:type="dxa" w:w="90"/>
-              <w:bottom w:type="dxa" w:w="60"/>
-              <w:right w:type="dxa" w:w="90"/>
-            </w:tcMar>
-          </w:tcPr>
-          <w:p>
-            <w:r>
-              <w:rPr>
-                <w:b w:val="false"/>
-                <w:bCs w:val="false"/>
-                <w:sz w:val="19"/>
-                <w:szCs w:val="19"/>
-              </w:rPr>
-              <w:t xml:space="preserve">~12%</w:t>
+            <w:tcW w:type="dxa" w:w="2500"/>
+            <w:shd w:fill="F2F6FC" w:val="clear"/>
+            <w:tcMar>
+              <w:top w:type="dxa" w:w="60"/>
+              <w:left w:type="dxa" w:w="90"/>
+              <w:bottom w:type="dxa" w:w="60"/>
+              <w:right w:type="dxa" w:w="90"/>
+            </w:tcMar>
+          </w:tcPr>
+          <w:p>
+            <w:r>
+              <w:rPr>
+                <w:b w:val="false"/>
+                <w:bCs w:val="false"/>
+                <w:sz w:val="19"/>
+                <w:szCs w:val="19"/>
+              </w:rPr>
+              <w:t xml:space="preserve">~12% off</w:t>
             </w:r>
           </w:p>
         </w:tc>
@@ -638,7 +638,7 @@
       <w:tr>
         <w:tc>
           <w:tcPr>
-            <w:tcW w:type="dxa" w:w="2160"/>
+            <w:tcW w:type="dxa" w:w="1900"/>
             <w:tcMar>
               <w:top w:type="dxa" w:w="60"/>
               <w:left w:type="dxa" w:w="90"/>
@@ -660,7 +660,7 @@
         </w:tc>
         <w:tc>
           <w:tcPr>
-            <w:tcW w:type="dxa" w:w="1900"/>
+            <w:tcW w:type="dxa" w:w="1700"/>
             <w:tcMar>
               <w:top w:type="dxa" w:w="60"/>
               <w:left w:type="dxa" w:w="90"/>
@@ -682,7 +682,7 @@
         </w:tc>
         <w:tc>
           <w:tcPr>
-            <w:tcW w:type="dxa" w:w="1700"/>
+            <w:tcW w:type="dxa" w:w="1500"/>
             <w:tcMar>
               <w:top w:type="dxa" w:w="60"/>
               <w:left w:type="dxa" w:w="90"/>
@@ -704,7 +704,7 @@
         </w:tc>
         <w:tc>
           <w:tcPr>
-            <w:tcW w:type="dxa" w:w="1900"/>
+            <w:tcW w:type="dxa" w:w="1760"/>
             <w:tcMar>
               <w:top w:type="dxa" w:w="60"/>
               <w:left w:type="dxa" w:w="90"/>
@@ -726,23 +726,23 @@
         </w:tc>
         <w:tc>
           <w:tcPr>
-            <w:tcW w:type="dxa" w:w="1700"/>
-            <w:tcMar>
-              <w:top w:type="dxa" w:w="60"/>
-              <w:left w:type="dxa" w:w="90"/>
-              <w:bottom w:type="dxa" w:w="60"/>
-              <w:right w:type="dxa" w:w="90"/>
-            </w:tcMar>
-          </w:tcPr>
-          <w:p>
-            <w:r>
-              <w:rPr>
-                <w:b w:val="false"/>
-                <w:bCs w:val="false"/>
-                <w:sz w:val="19"/>
-                <w:szCs w:val="19"/>
-              </w:rPr>
-              <w:t xml:space="preserve">20%</w:t>
+            <w:tcW w:type="dxa" w:w="2500"/>
+            <w:tcMar>
+              <w:top w:type="dxa" w:w="60"/>
+              <w:left w:type="dxa" w:w="90"/>
+              <w:bottom w:type="dxa" w:w="60"/>
+              <w:right w:type="dxa" w:w="90"/>
+            </w:tcMar>
+          </w:tcPr>
+          <w:p>
+            <w:r>
+              <w:rPr>
+                <w:b w:val="false"/>
+                <w:bCs w:val="false"/>
+                <w:sz w:val="19"/>
+                <w:szCs w:val="19"/>
+              </w:rPr>
+              <w:t xml:space="preserve">20% off</w:t>
             </w:r>
           </w:p>
         </w:tc>
@@ -750,7 +750,7 @@
       <w:tr>
         <w:tc>
           <w:tcPr>
-            <w:tcW w:type="dxa" w:w="2160"/>
+            <w:tcW w:type="dxa" w:w="1900"/>
             <w:shd w:fill="F2F6FC" w:val="clear"/>
             <w:tcMar>
               <w:top w:type="dxa" w:w="60"/>
@@ -773,29 +773,6 @@
         </w:tc>
         <w:tc>
           <w:tcPr>
-            <w:tcW w:type="dxa" w:w="1900"/>
-            <w:shd w:fill="F2F6FC" w:val="clear"/>
-            <w:tcMar>
-              <w:top w:type="dxa" w:w="60"/>
-              <w:left w:type="dxa" w:w="90"/>
-              <w:bottom w:type="dxa" w:w="60"/>
-              <w:right w:type="dxa" w:w="90"/>
-            </w:tcMar>
-          </w:tcPr>
-          <w:p>
-            <w:r>
-              <w:rPr>
-                <w:b w:val="false"/>
-                <w:bCs w:val="false"/>
-                <w:sz w:val="19"/>
-                <w:szCs w:val="19"/>
-              </w:rPr>
-              <w:t xml:space="preserve">$10.50</w:t>
-            </w:r>
-          </w:p>
-        </w:tc>
-        <w:tc>
-          <w:tcPr>
             <w:tcW w:type="dxa" w:w="1700"/>
             <w:shd w:fill="F2F6FC" w:val="clear"/>
             <w:tcMar>
@@ -813,53 +790,76 @@
                 <w:sz w:val="19"/>
                 <w:szCs w:val="19"/>
               </w:rPr>
-              <w:t xml:space="preserve">$10.50</w:t>
-            </w:r>
-          </w:p>
-        </w:tc>
-        <w:tc>
-          <w:tcPr>
-            <w:tcW w:type="dxa" w:w="1900"/>
-            <w:shd w:fill="F2F6FC" w:val="clear"/>
-            <w:tcMar>
-              <w:top w:type="dxa" w:w="60"/>
-              <w:left w:type="dxa" w:w="90"/>
-              <w:bottom w:type="dxa" w:w="60"/>
-              <w:right w:type="dxa" w:w="90"/>
-            </w:tcMar>
-          </w:tcPr>
-          <w:p>
-            <w:r>
-              <w:rPr>
-                <w:b w:val="false"/>
-                <w:bCs w:val="false"/>
-                <w:sz w:val="19"/>
-                <w:szCs w:val="19"/>
-              </w:rPr>
-              <w:t xml:space="preserve">$17.50</w:t>
-            </w:r>
-          </w:p>
-        </w:tc>
-        <w:tc>
-          <w:tcPr>
-            <w:tcW w:type="dxa" w:w="1700"/>
-            <w:shd w:fill="F2F6FC" w:val="clear"/>
-            <w:tcMar>
-              <w:top w:type="dxa" w:w="60"/>
-              <w:left w:type="dxa" w:w="90"/>
-              <w:bottom w:type="dxa" w:w="60"/>
-              <w:right w:type="dxa" w:w="90"/>
-            </w:tcMar>
-          </w:tcPr>
-          <w:p>
-            <w:r>
-              <w:rPr>
-                <w:b w:val="false"/>
-                <w:bCs w:val="false"/>
-                <w:sz w:val="19"/>
-                <w:szCs w:val="19"/>
-              </w:rPr>
-              <w:t xml:space="preserve">30%</w:t>
+              <w:t xml:space="preserve">$9.00</w:t>
+            </w:r>
+          </w:p>
+        </w:tc>
+        <w:tc>
+          <w:tcPr>
+            <w:tcW w:type="dxa" w:w="1500"/>
+            <w:shd w:fill="F2F6FC" w:val="clear"/>
+            <w:tcMar>
+              <w:top w:type="dxa" w:w="60"/>
+              <w:left w:type="dxa" w:w="90"/>
+              <w:bottom w:type="dxa" w:w="60"/>
+              <w:right w:type="dxa" w:w="90"/>
+            </w:tcMar>
+          </w:tcPr>
+          <w:p>
+            <w:r>
+              <w:rPr>
+                <w:b w:val="false"/>
+                <w:bCs w:val="false"/>
+                <w:sz w:val="19"/>
+                <w:szCs w:val="19"/>
+              </w:rPr>
+              <w:t xml:space="preserve">$9.00</w:t>
+            </w:r>
+          </w:p>
+        </w:tc>
+        <w:tc>
+          <w:tcPr>
+            <w:tcW w:type="dxa" w:w="1760"/>
+            <w:shd w:fill="F2F6FC" w:val="clear"/>
+            <w:tcMar>
+              <w:top w:type="dxa" w:w="60"/>
+              <w:left w:type="dxa" w:w="90"/>
+              <w:bottom w:type="dxa" w:w="60"/>
+              <w:right w:type="dxa" w:w="90"/>
+            </w:tcMar>
+          </w:tcPr>
+          <w:p>
+            <w:r>
+              <w:rPr>
+                <w:b w:val="false"/>
+                <w:bCs w:val="false"/>
+                <w:sz w:val="19"/>
+                <w:szCs w:val="19"/>
+              </w:rPr>
+              <w:t xml:space="preserve">$14.00</w:t>
+            </w:r>
+          </w:p>
+        </w:tc>
+        <w:tc>
+          <w:tcPr>
+            <w:tcW w:type="dxa" w:w="2500"/>
+            <w:shd w:fill="F2F6FC" w:val="clear"/>
+            <w:tcMar>
+              <w:top w:type="dxa" w:w="60"/>
+              <w:left w:type="dxa" w:w="90"/>
+              <w:bottom w:type="dxa" w:w="60"/>
+              <w:right w:type="dxa" w:w="90"/>
+            </w:tcMar>
+          </w:tcPr>
+          <w:p>
+            <w:r>
+              <w:rPr>
+                <w:b w:val="false"/>
+                <w:bCs w:val="false"/>
+                <w:sz w:val="19"/>
+                <w:szCs w:val="19"/>
+              </w:rPr>
+              <w:t xml:space="preserve">Bigger discount (~44%)</w:t>
             </w:r>
           </w:p>
         </w:tc>
@@ -867,28 +867,6 @@
       <w:tr>
         <w:tc>
           <w:tcPr>
-            <w:tcW w:type="dxa" w:w="2160"/>
-            <w:tcMar>
-              <w:top w:type="dxa" w:w="60"/>
-              <w:left w:type="dxa" w:w="90"/>
-              <w:bottom w:type="dxa" w:w="60"/>
-              <w:right w:type="dxa" w:w="90"/>
-            </w:tcMar>
-          </w:tcPr>
-          <w:p>
-            <w:r>
-              <w:rPr>
-                <w:b w:val="false"/>
-                <w:bCs w:val="false"/>
-                <w:sz w:val="19"/>
-                <w:szCs w:val="19"/>
-              </w:rPr>
-              <w:t xml:space="preserve">50+ units</w:t>
-            </w:r>
-          </w:p>
-        </w:tc>
-        <w:tc>
-          <w:tcPr>
             <w:tcW w:type="dxa" w:w="1900"/>
             <w:tcMar>
               <w:top w:type="dxa" w:w="60"/>
@@ -905,7 +883,7 @@
                 <w:sz w:val="19"/>
                 <w:szCs w:val="19"/>
               </w:rPr>
-              <w:t xml:space="preserve">$9.00</w:t>
+              <w:t xml:space="preserve">50–100 units</w:t>
             </w:r>
           </w:p>
         </w:tc>
@@ -927,56 +905,90 @@
                 <w:sz w:val="19"/>
                 <w:szCs w:val="19"/>
               </w:rPr>
-              <w:t xml:space="preserve">$9.00</w:t>
-            </w:r>
-          </w:p>
-        </w:tc>
-        <w:tc>
-          <w:tcPr>
-            <w:tcW w:type="dxa" w:w="1900"/>
-            <w:tcMar>
-              <w:top w:type="dxa" w:w="60"/>
-              <w:left w:type="dxa" w:w="90"/>
-              <w:bottom w:type="dxa" w:w="60"/>
-              <w:right w:type="dxa" w:w="90"/>
-            </w:tcMar>
-          </w:tcPr>
-          <w:p>
-            <w:r>
-              <w:rPr>
-                <w:b w:val="false"/>
-                <w:bCs w:val="false"/>
-                <w:sz w:val="19"/>
-                <w:szCs w:val="19"/>
-              </w:rPr>
-              <w:t xml:space="preserve">$15.00</w:t>
-            </w:r>
-          </w:p>
-        </w:tc>
-        <w:tc>
-          <w:tcPr>
-            <w:tcW w:type="dxa" w:w="1700"/>
-            <w:tcMar>
-              <w:top w:type="dxa" w:w="60"/>
-              <w:left w:type="dxa" w:w="90"/>
-              <w:bottom w:type="dxa" w:w="60"/>
-              <w:right w:type="dxa" w:w="90"/>
-            </w:tcMar>
-          </w:tcPr>
-          <w:p>
-            <w:r>
-              <w:rPr>
-                <w:b w:val="false"/>
-                <w:bCs w:val="false"/>
-                <w:sz w:val="19"/>
-                <w:szCs w:val="19"/>
-              </w:rPr>
-              <w:t xml:space="preserve">40%</w:t>
+              <w:t xml:space="preserve">—</w:t>
+            </w:r>
+          </w:p>
+        </w:tc>
+        <w:tc>
+          <w:tcPr>
+            <w:tcW w:type="dxa" w:w="1500"/>
+            <w:tcMar>
+              <w:top w:type="dxa" w:w="60"/>
+              <w:left w:type="dxa" w:w="90"/>
+              <w:bottom w:type="dxa" w:w="60"/>
+              <w:right w:type="dxa" w:w="90"/>
+            </w:tcMar>
+          </w:tcPr>
+          <w:p>
+            <w:r>
+              <w:rPr>
+                <w:b w:val="false"/>
+                <w:bCs w:val="false"/>
+                <w:sz w:val="19"/>
+                <w:szCs w:val="19"/>
+              </w:rPr>
+              <w:t xml:space="preserve">—</w:t>
+            </w:r>
+          </w:p>
+        </w:tc>
+        <w:tc>
+          <w:tcPr>
+            <w:tcW w:type="dxa" w:w="1760"/>
+            <w:tcMar>
+              <w:top w:type="dxa" w:w="60"/>
+              <w:left w:type="dxa" w:w="90"/>
+              <w:bottom w:type="dxa" w:w="60"/>
+              <w:right w:type="dxa" w:w="90"/>
+            </w:tcMar>
+          </w:tcPr>
+          <w:p>
+            <w:r>
+              <w:rPr>
+                <w:b w:val="false"/>
+                <w:bCs w:val="false"/>
+                <w:sz w:val="19"/>
+                <w:szCs w:val="19"/>
+              </w:rPr>
+              <w:t xml:space="preserve">FLAT $500/mo</w:t>
+            </w:r>
+          </w:p>
+        </w:tc>
+        <w:tc>
+          <w:tcPr>
+            <w:tcW w:type="dxa" w:w="2500"/>
+            <w:tcMar>
+              <w:top w:type="dxa" w:w="60"/>
+              <w:left w:type="dxa" w:w="90"/>
+              <w:bottom w:type="dxa" w:w="60"/>
+              <w:right w:type="dxa" w:w="90"/>
+            </w:tcMar>
+          </w:tcPr>
+          <w:p>
+            <w:r>
+              <w:rPr>
+                <w:b w:val="false"/>
+                <w:bCs w:val="false"/>
+                <w:sz w:val="19"/>
+                <w:szCs w:val="19"/>
+              </w:rPr>
+              <w:t xml:space="preserve">Enterprise (≈$6.67/unit)</w:t>
             </w:r>
           </w:p>
         </w:tc>
       </w:tr>
     </w:tbl>
+    <w:p>
+      <w:pPr>
+        <w:spacing w:after="120"/>
+      </w:pPr>
+      <w:r>
+        <w:rPr>
+          <w:sz w:val="20"/>
+          <w:szCs w:val="20"/>
+        </w:rPr>
+        <w:t xml:space="preserve">Enterprise clients (50–100 units) pay a flat $500/month — a deep per-unit discount that makes Condo Assistant a no-brainer for property-management companies. 100+ units is a custom quote.</w:t>
+      </w:r>
+    </w:p>
     <w:p>
       <w:pPr>
         <w:pStyle w:val="Heading1"/>
@@ -1029,8 +1041,8 @@
         <w:gridCol w:w="1660"/>
         <w:gridCol w:w="1200"/>
         <w:gridCol w:w="1300"/>
-        <w:gridCol w:w="1300"/>
-        <w:gridCol w:w="1500"/>
+        <w:gridCol w:w="1400"/>
+        <w:gridCol w:w="1400"/>
         <w:gridCol w:w="2400"/>
       </w:tblGrid>
       <w:tr>
@@ -1081,7 +1093,7 @@
                 <w:sz w:val="19"/>
                 <w:szCs w:val="19"/>
               </w:rPr>
-              <w:t xml:space="preserve">% Clients</w:t>
+              <w:t xml:space="preserve"># Clients</w:t>
             </w:r>
           </w:p>
         </w:tc>
@@ -1105,13 +1117,13 @@
                 <w:sz w:val="19"/>
                 <w:szCs w:val="19"/>
               </w:rPr>
-              <w:t xml:space="preserve"># Clients</w:t>
-            </w:r>
-          </w:p>
-        </w:tc>
-        <w:tc>
-          <w:tcPr>
-            <w:tcW w:type="dxa" w:w="1300"/>
+              <w:t xml:space="preserve">Avg Units</w:t>
+            </w:r>
+          </w:p>
+        </w:tc>
+        <w:tc>
+          <w:tcPr>
+            <w:tcW w:type="dxa" w:w="1400"/>
             <w:shd w:fill="1F3864" w:val="clear"/>
             <w:tcMar>
               <w:top w:type="dxa" w:w="60"/>
@@ -1129,13 +1141,13 @@
                 <w:sz w:val="19"/>
                 <w:szCs w:val="19"/>
               </w:rPr>
-              <w:t xml:space="preserve">Avg Units</w:t>
-            </w:r>
-          </w:p>
-        </w:tc>
-        <w:tc>
-          <w:tcPr>
-            <w:tcW w:type="dxa" w:w="1500"/>
+              <w:t xml:space="preserve">Total Units</w:t>
+            </w:r>
+          </w:p>
+        </w:tc>
+        <w:tc>
+          <w:tcPr>
+            <w:tcW w:type="dxa" w:w="1400"/>
             <w:shd w:fill="1F3864" w:val="clear"/>
             <w:tcMar>
               <w:top w:type="dxa" w:w="60"/>
@@ -1153,7 +1165,7 @@
                 <w:sz w:val="19"/>
                 <w:szCs w:val="19"/>
               </w:rPr>
-              <w:t xml:space="preserve">Total Units</w:t>
+              <w:t xml:space="preserve">Pricing</w:t>
             </w:r>
           </w:p>
         </w:tc>
@@ -1223,7 +1235,7 @@
                 <w:sz w:val="19"/>
                 <w:szCs w:val="19"/>
               </w:rPr>
-              <w:t xml:space="preserve">70%</w:t>
+              <w:t xml:space="preserve">4,000</w:t>
             </w:r>
           </w:p>
         </w:tc>
@@ -1245,51 +1257,51 @@
                 <w:sz w:val="19"/>
                 <w:szCs w:val="19"/>
               </w:rPr>
-              <w:t xml:space="preserve">3,500</w:t>
-            </w:r>
-          </w:p>
-        </w:tc>
-        <w:tc>
-          <w:tcPr>
-            <w:tcW w:type="dxa" w:w="1300"/>
-            <w:tcMar>
-              <w:top w:type="dxa" w:w="60"/>
-              <w:left w:type="dxa" w:w="90"/>
-              <w:bottom w:type="dxa" w:w="60"/>
-              <w:right w:type="dxa" w:w="90"/>
-            </w:tcMar>
-          </w:tcPr>
-          <w:p>
-            <w:r>
-              <w:rPr>
-                <w:b w:val="false"/>
-                <w:bCs w:val="false"/>
-                <w:sz w:val="19"/>
-                <w:szCs w:val="19"/>
-              </w:rPr>
               <w:t xml:space="preserve">1.5</w:t>
             </w:r>
           </w:p>
         </w:tc>
         <w:tc>
           <w:tcPr>
-            <w:tcW w:type="dxa" w:w="1500"/>
-            <w:tcMar>
-              <w:top w:type="dxa" w:w="60"/>
-              <w:left w:type="dxa" w:w="90"/>
-              <w:bottom w:type="dxa" w:w="60"/>
-              <w:right w:type="dxa" w:w="90"/>
-            </w:tcMar>
-          </w:tcPr>
-          <w:p>
-            <w:r>
-              <w:rPr>
-                <w:b w:val="false"/>
-                <w:bCs w:val="false"/>
-                <w:sz w:val="19"/>
-                <w:szCs w:val="19"/>
-              </w:rPr>
-              <w:t xml:space="preserve">5,250</w:t>
+            <w:tcW w:type="dxa" w:w="1400"/>
+            <w:tcMar>
+              <w:top w:type="dxa" w:w="60"/>
+              <w:left w:type="dxa" w:w="90"/>
+              <w:bottom w:type="dxa" w:w="60"/>
+              <w:right w:type="dxa" w:w="90"/>
+            </w:tcMar>
+          </w:tcPr>
+          <w:p>
+            <w:r>
+              <w:rPr>
+                <w:b w:val="false"/>
+                <w:bCs w:val="false"/>
+                <w:sz w:val="19"/>
+                <w:szCs w:val="19"/>
+              </w:rPr>
+              <w:t xml:space="preserve">6,000</w:t>
+            </w:r>
+          </w:p>
+        </w:tc>
+        <w:tc>
+          <w:tcPr>
+            <w:tcW w:type="dxa" w:w="1400"/>
+            <w:tcMar>
+              <w:top w:type="dxa" w:w="60"/>
+              <w:left w:type="dxa" w:w="90"/>
+              <w:bottom w:type="dxa" w:w="60"/>
+              <w:right w:type="dxa" w:w="90"/>
+            </w:tcMar>
+          </w:tcPr>
+          <w:p>
+            <w:r>
+              <w:rPr>
+                <w:b w:val="false"/>
+                <w:bCs w:val="false"/>
+                <w:sz w:val="19"/>
+                <w:szCs w:val="19"/>
+              </w:rPr>
+              <w:t xml:space="preserve">per-unit</w:t>
             </w:r>
           </w:p>
         </w:tc>
@@ -1311,7 +1323,7 @@
                 <w:sz w:val="19"/>
                 <w:szCs w:val="19"/>
               </w:rPr>
-              <w:t xml:space="preserve">$112,875</w:t>
+              <w:t xml:space="preserve">$129,000</w:t>
             </w:r>
           </w:p>
         </w:tc>
@@ -1359,7 +1371,7 @@
                 <w:sz w:val="19"/>
                 <w:szCs w:val="19"/>
               </w:rPr>
-              <w:t xml:space="preserve">20%</w:t>
+              <w:t xml:space="preserve">500</w:t>
             </w:r>
           </w:p>
         </w:tc>
@@ -1382,53 +1394,53 @@
                 <w:sz w:val="19"/>
                 <w:szCs w:val="19"/>
               </w:rPr>
-              <w:t xml:space="preserve">1,000</w:t>
-            </w:r>
-          </w:p>
-        </w:tc>
-        <w:tc>
-          <w:tcPr>
-            <w:tcW w:type="dxa" w:w="1300"/>
-            <w:shd w:fill="F2F6FC" w:val="clear"/>
-            <w:tcMar>
-              <w:top w:type="dxa" w:w="60"/>
-              <w:left w:type="dxa" w:w="90"/>
-              <w:bottom w:type="dxa" w:w="60"/>
-              <w:right w:type="dxa" w:w="90"/>
-            </w:tcMar>
-          </w:tcPr>
-          <w:p>
-            <w:r>
-              <w:rPr>
-                <w:b w:val="false"/>
-                <w:bCs w:val="false"/>
-                <w:sz w:val="19"/>
-                <w:szCs w:val="19"/>
-              </w:rPr>
               <w:t xml:space="preserve">5</w:t>
             </w:r>
           </w:p>
         </w:tc>
         <w:tc>
           <w:tcPr>
-            <w:tcW w:type="dxa" w:w="1500"/>
-            <w:shd w:fill="F2F6FC" w:val="clear"/>
-            <w:tcMar>
-              <w:top w:type="dxa" w:w="60"/>
-              <w:left w:type="dxa" w:w="90"/>
-              <w:bottom w:type="dxa" w:w="60"/>
-              <w:right w:type="dxa" w:w="90"/>
-            </w:tcMar>
-          </w:tcPr>
-          <w:p>
-            <w:r>
-              <w:rPr>
-                <w:b w:val="false"/>
-                <w:bCs w:val="false"/>
-                <w:sz w:val="19"/>
-                <w:szCs w:val="19"/>
-              </w:rPr>
-              <w:t xml:space="preserve">5,000</w:t>
+            <w:tcW w:type="dxa" w:w="1400"/>
+            <w:shd w:fill="F2F6FC" w:val="clear"/>
+            <w:tcMar>
+              <w:top w:type="dxa" w:w="60"/>
+              <w:left w:type="dxa" w:w="90"/>
+              <w:bottom w:type="dxa" w:w="60"/>
+              <w:right w:type="dxa" w:w="90"/>
+            </w:tcMar>
+          </w:tcPr>
+          <w:p>
+            <w:r>
+              <w:rPr>
+                <w:b w:val="false"/>
+                <w:bCs w:val="false"/>
+                <w:sz w:val="19"/>
+                <w:szCs w:val="19"/>
+              </w:rPr>
+              <w:t xml:space="preserve">2,500</w:t>
+            </w:r>
+          </w:p>
+        </w:tc>
+        <w:tc>
+          <w:tcPr>
+            <w:tcW w:type="dxa" w:w="1400"/>
+            <w:shd w:fill="F2F6FC" w:val="clear"/>
+            <w:tcMar>
+              <w:top w:type="dxa" w:w="60"/>
+              <w:left w:type="dxa" w:w="90"/>
+              <w:bottom w:type="dxa" w:w="60"/>
+              <w:right w:type="dxa" w:w="90"/>
+            </w:tcMar>
+          </w:tcPr>
+          <w:p>
+            <w:r>
+              <w:rPr>
+                <w:b w:val="false"/>
+                <w:bCs w:val="false"/>
+                <w:sz w:val="19"/>
+                <w:szCs w:val="19"/>
+              </w:rPr>
+              <w:t xml:space="preserve">per-unit</w:t>
             </w:r>
           </w:p>
         </w:tc>
@@ -1451,7 +1463,7 @@
                 <w:sz w:val="19"/>
                 <w:szCs w:val="19"/>
               </w:rPr>
-              <w:t xml:space="preserve">$94,688</w:t>
+              <w:t xml:space="preserve">$47,344</w:t>
             </w:r>
           </w:p>
         </w:tc>
@@ -1497,7 +1509,7 @@
                 <w:sz w:val="19"/>
                 <w:szCs w:val="19"/>
               </w:rPr>
-              <w:t xml:space="preserve">6%</w:t>
+              <w:t xml:space="preserve">300</w:t>
             </w:r>
           </w:p>
         </w:tc>
@@ -1519,35 +1531,13 @@
                 <w:sz w:val="19"/>
                 <w:szCs w:val="19"/>
               </w:rPr>
-              <w:t xml:space="preserve">300</w:t>
-            </w:r>
-          </w:p>
-        </w:tc>
-        <w:tc>
-          <w:tcPr>
-            <w:tcW w:type="dxa" w:w="1300"/>
-            <w:tcMar>
-              <w:top w:type="dxa" w:w="60"/>
-              <w:left w:type="dxa" w:w="90"/>
-              <w:bottom w:type="dxa" w:w="60"/>
-              <w:right w:type="dxa" w:w="90"/>
-            </w:tcMar>
-          </w:tcPr>
-          <w:p>
-            <w:r>
-              <w:rPr>
-                <w:b w:val="false"/>
-                <w:bCs w:val="false"/>
-                <w:sz w:val="19"/>
-                <w:szCs w:val="19"/>
-              </w:rPr>
               <w:t xml:space="preserve">13</w:t>
             </w:r>
           </w:p>
         </w:tc>
         <w:tc>
           <w:tcPr>
-            <w:tcW w:type="dxa" w:w="1500"/>
+            <w:tcW w:type="dxa" w:w="1400"/>
             <w:tcMar>
               <w:top w:type="dxa" w:w="60"/>
               <w:left w:type="dxa" w:w="90"/>
@@ -1564,6 +1554,28 @@
                 <w:szCs w:val="19"/>
               </w:rPr>
               <w:t xml:space="preserve">3,900</w:t>
+            </w:r>
+          </w:p>
+        </w:tc>
+        <w:tc>
+          <w:tcPr>
+            <w:tcW w:type="dxa" w:w="1400"/>
+            <w:tcMar>
+              <w:top w:type="dxa" w:w="60"/>
+              <w:left w:type="dxa" w:w="90"/>
+              <w:bottom w:type="dxa" w:w="60"/>
+              <w:right w:type="dxa" w:w="90"/>
+            </w:tcMar>
+          </w:tcPr>
+          <w:p>
+            <w:r>
+              <w:rPr>
+                <w:b w:val="false"/>
+                <w:bCs w:val="false"/>
+                <w:sz w:val="19"/>
+                <w:szCs w:val="19"/>
+              </w:rPr>
+              <w:t xml:space="preserve">per-unit</w:t>
             </w:r>
           </w:p>
         </w:tc>
@@ -1633,7 +1645,7 @@
                 <w:sz w:val="19"/>
                 <w:szCs w:val="19"/>
               </w:rPr>
-              <w:t xml:space="preserve">3%</w:t>
+              <w:t xml:space="preserve">200</w:t>
             </w:r>
           </w:p>
         </w:tc>
@@ -1656,53 +1668,53 @@
                 <w:sz w:val="19"/>
                 <w:szCs w:val="19"/>
               </w:rPr>
-              <w:t xml:space="preserve">150</w:t>
-            </w:r>
-          </w:p>
-        </w:tc>
-        <w:tc>
-          <w:tcPr>
-            <w:tcW w:type="dxa" w:w="1300"/>
-            <w:shd w:fill="F2F6FC" w:val="clear"/>
-            <w:tcMar>
-              <w:top w:type="dxa" w:w="60"/>
-              <w:left w:type="dxa" w:w="90"/>
-              <w:bottom w:type="dxa" w:w="60"/>
-              <w:right w:type="dxa" w:w="90"/>
-            </w:tcMar>
-          </w:tcPr>
-          <w:p>
-            <w:r>
-              <w:rPr>
-                <w:b w:val="false"/>
-                <w:bCs w:val="false"/>
-                <w:sz w:val="19"/>
-                <w:szCs w:val="19"/>
-              </w:rPr>
               <w:t xml:space="preserve">30</w:t>
             </w:r>
           </w:p>
         </w:tc>
         <w:tc>
           <w:tcPr>
-            <w:tcW w:type="dxa" w:w="1500"/>
-            <w:shd w:fill="F2F6FC" w:val="clear"/>
-            <w:tcMar>
-              <w:top w:type="dxa" w:w="60"/>
-              <w:left w:type="dxa" w:w="90"/>
-              <w:bottom w:type="dxa" w:w="60"/>
-              <w:right w:type="dxa" w:w="90"/>
-            </w:tcMar>
-          </w:tcPr>
-          <w:p>
-            <w:r>
-              <w:rPr>
-                <w:b w:val="false"/>
-                <w:bCs w:val="false"/>
-                <w:sz w:val="19"/>
-                <w:szCs w:val="19"/>
-              </w:rPr>
-              <w:t xml:space="preserve">4,500</w:t>
+            <w:tcW w:type="dxa" w:w="1400"/>
+            <w:shd w:fill="F2F6FC" w:val="clear"/>
+            <w:tcMar>
+              <w:top w:type="dxa" w:w="60"/>
+              <w:left w:type="dxa" w:w="90"/>
+              <w:bottom w:type="dxa" w:w="60"/>
+              <w:right w:type="dxa" w:w="90"/>
+            </w:tcMar>
+          </w:tcPr>
+          <w:p>
+            <w:r>
+              <w:rPr>
+                <w:b w:val="false"/>
+                <w:bCs w:val="false"/>
+                <w:sz w:val="19"/>
+                <w:szCs w:val="19"/>
+              </w:rPr>
+              <w:t xml:space="preserve">6,000</w:t>
+            </w:r>
+          </w:p>
+        </w:tc>
+        <w:tc>
+          <w:tcPr>
+            <w:tcW w:type="dxa" w:w="1400"/>
+            <w:shd w:fill="F2F6FC" w:val="clear"/>
+            <w:tcMar>
+              <w:top w:type="dxa" w:w="60"/>
+              <w:left w:type="dxa" w:w="90"/>
+              <w:bottom w:type="dxa" w:w="60"/>
+              <w:right w:type="dxa" w:w="90"/>
+            </w:tcMar>
+          </w:tcPr>
+          <w:p>
+            <w:r>
+              <w:rPr>
+                <w:b w:val="false"/>
+                <w:bCs w:val="false"/>
+                <w:sz w:val="19"/>
+                <w:szCs w:val="19"/>
+              </w:rPr>
+              <w:t xml:space="preserve">per-unit</w:t>
             </w:r>
           </w:p>
         </w:tc>
@@ -1725,7 +1737,7 @@
                 <w:sz w:val="19"/>
                 <w:szCs w:val="19"/>
               </w:rPr>
-              <w:t xml:space="preserve">$67,725</w:t>
+              <w:t xml:space="preserve">$73,500</w:t>
             </w:r>
           </w:p>
         </w:tc>
@@ -1749,7 +1761,7 @@
                 <w:sz w:val="19"/>
                 <w:szCs w:val="19"/>
               </w:rPr>
-              <w:t xml:space="preserve">50+ units</w:t>
+              <w:t xml:space="preserve">50–100 units</w:t>
             </w:r>
           </w:p>
         </w:tc>
@@ -1771,7 +1783,7 @@
                 <w:sz w:val="19"/>
                 <w:szCs w:val="19"/>
               </w:rPr>
-              <w:t xml:space="preserve">1%</w:t>
+              <w:t xml:space="preserve">50</w:t>
             </w:r>
           </w:p>
         </w:tc>
@@ -1793,35 +1805,13 @@
                 <w:sz w:val="19"/>
                 <w:szCs w:val="19"/>
               </w:rPr>
-              <w:t xml:space="preserve">50</w:t>
-            </w:r>
-          </w:p>
-        </w:tc>
-        <w:tc>
-          <w:tcPr>
-            <w:tcW w:type="dxa" w:w="1300"/>
-            <w:tcMar>
-              <w:top w:type="dxa" w:w="60"/>
-              <w:left w:type="dxa" w:w="90"/>
-              <w:bottom w:type="dxa" w:w="60"/>
-              <w:right w:type="dxa" w:w="90"/>
-            </w:tcMar>
-          </w:tcPr>
-          <w:p>
-            <w:r>
-              <w:rPr>
-                <w:b w:val="false"/>
-                <w:bCs w:val="false"/>
-                <w:sz w:val="19"/>
-                <w:szCs w:val="19"/>
-              </w:rPr>
               <w:t xml:space="preserve">75</w:t>
             </w:r>
           </w:p>
         </w:tc>
         <w:tc>
           <w:tcPr>
-            <w:tcW w:type="dxa" w:w="1500"/>
+            <w:tcW w:type="dxa" w:w="1400"/>
             <w:tcMar>
               <w:top w:type="dxa" w:w="60"/>
               <w:left w:type="dxa" w:w="90"/>
@@ -1843,6 +1833,28 @@
         </w:tc>
         <w:tc>
           <w:tcPr>
+            <w:tcW w:type="dxa" w:w="1400"/>
+            <w:tcMar>
+              <w:top w:type="dxa" w:w="60"/>
+              <w:left w:type="dxa" w:w="90"/>
+              <w:bottom w:type="dxa" w:w="60"/>
+              <w:right w:type="dxa" w:w="90"/>
+            </w:tcMar>
+          </w:tcPr>
+          <w:p>
+            <w:r>
+              <w:rPr>
+                <w:b w:val="false"/>
+                <w:bCs w:val="false"/>
+                <w:sz w:val="19"/>
+                <w:szCs w:val="19"/>
+              </w:rPr>
+              <w:t xml:space="preserve">flat $500</w:t>
+            </w:r>
+          </w:p>
+        </w:tc>
+        <w:tc>
+          <w:tcPr>
             <w:tcW w:type="dxa" w:w="2400"/>
             <w:tcMar>
               <w:top w:type="dxa" w:w="60"/>
@@ -1859,7 +1871,7 @@
                 <w:sz w:val="19"/>
                 <w:szCs w:val="19"/>
               </w:rPr>
-              <w:t xml:space="preserve">$48,375</w:t>
+              <w:t xml:space="preserve">$25,000</w:t>
             </w:r>
           </w:p>
         </w:tc>
@@ -1907,7 +1919,7 @@
                 <w:sz w:val="19"/>
                 <w:szCs w:val="19"/>
               </w:rPr>
-              <w:t xml:space="preserve">100%</w:t>
+              <w:t xml:space="preserve">5,050</w:t>
             </w:r>
           </w:p>
         </w:tc>
@@ -1930,53 +1942,53 @@
                 <w:sz w:val="19"/>
                 <w:szCs w:val="19"/>
               </w:rPr>
-              <w:t xml:space="preserve">5,000</w:t>
-            </w:r>
-          </w:p>
-        </w:tc>
-        <w:tc>
-          <w:tcPr>
-            <w:tcW w:type="dxa" w:w="1300"/>
-            <w:shd w:fill="F2F6FC" w:val="clear"/>
-            <w:tcMar>
-              <w:top w:type="dxa" w:w="60"/>
-              <w:left w:type="dxa" w:w="90"/>
-              <w:bottom w:type="dxa" w:w="60"/>
-              <w:right w:type="dxa" w:w="90"/>
-            </w:tcMar>
-          </w:tcPr>
-          <w:p>
-            <w:r>
-              <w:rPr>
-                <w:b w:val="false"/>
-                <w:bCs w:val="false"/>
-                <w:sz w:val="19"/>
-                <w:szCs w:val="19"/>
-              </w:rPr>
-              <w:t xml:space="preserve">4.5 avg</w:t>
-            </w:r>
-          </w:p>
-        </w:tc>
-        <w:tc>
-          <w:tcPr>
-            <w:tcW w:type="dxa" w:w="1500"/>
-            <w:shd w:fill="F2F6FC" w:val="clear"/>
-            <w:tcMar>
-              <w:top w:type="dxa" w:w="60"/>
-              <w:left w:type="dxa" w:w="90"/>
-              <w:bottom w:type="dxa" w:w="60"/>
-              <w:right w:type="dxa" w:w="90"/>
-            </w:tcMar>
-          </w:tcPr>
-          <w:p>
-            <w:r>
-              <w:rPr>
-                <w:b w:val="false"/>
-                <w:bCs w:val="false"/>
-                <w:sz w:val="19"/>
-                <w:szCs w:val="19"/>
-              </w:rPr>
-              <w:t xml:space="preserve">22,400</w:t>
+              <w:t xml:space="preserve">4.4 avg</w:t>
+            </w:r>
+          </w:p>
+        </w:tc>
+        <w:tc>
+          <w:tcPr>
+            <w:tcW w:type="dxa" w:w="1400"/>
+            <w:shd w:fill="F2F6FC" w:val="clear"/>
+            <w:tcMar>
+              <w:top w:type="dxa" w:w="60"/>
+              <w:left w:type="dxa" w:w="90"/>
+              <w:bottom w:type="dxa" w:w="60"/>
+              <w:right w:type="dxa" w:w="90"/>
+            </w:tcMar>
+          </w:tcPr>
+          <w:p>
+            <w:r>
+              <w:rPr>
+                <w:b w:val="false"/>
+                <w:bCs w:val="false"/>
+                <w:sz w:val="19"/>
+                <w:szCs w:val="19"/>
+              </w:rPr>
+              <w:t xml:space="preserve">22,150</w:t>
+            </w:r>
+          </w:p>
+        </w:tc>
+        <w:tc>
+          <w:tcPr>
+            <w:tcW w:type="dxa" w:w="1400"/>
+            <w:shd w:fill="F2F6FC" w:val="clear"/>
+            <w:tcMar>
+              <w:top w:type="dxa" w:w="60"/>
+              <w:left w:type="dxa" w:w="90"/>
+              <w:bottom w:type="dxa" w:w="60"/>
+              <w:right w:type="dxa" w:w="90"/>
+            </w:tcMar>
+          </w:tcPr>
+          <w:p>
+            <w:r>
+              <w:rPr>
+                <w:b w:val="false"/>
+                <w:bCs w:val="false"/>
+                <w:sz w:val="19"/>
+                <w:szCs w:val="19"/>
+              </w:rPr>
+              <w:t xml:space="preserve">—</w:t>
             </w:r>
           </w:p>
         </w:tc>
@@ -1999,7 +2011,7 @@
                 <w:sz w:val="19"/>
                 <w:szCs w:val="19"/>
               </w:rPr>
-              <w:t xml:space="preserve">$390,743</w:t>
+              <w:t xml:space="preserve">$341,924</w:t>
             </w:r>
           </w:p>
         </w:tc>
@@ -2022,7 +2034,7 @@
           <w:sz w:val="24"/>
           <w:szCs w:val="24"/>
         </w:rPr>
-        <w:t xml:space="preserve">Annual Recurring Revenue at full penetration: ~$4.69M.</w:t>
+        <w:t xml:space="preserve">Annual Recurring Revenue at full penetration: ~$4.1M.</w:t>
       </w:r>
     </w:p>
     <w:p>
@@ -2037,7 +2049,7 @@
           <w:sz w:val="18"/>
           <w:szCs w:val="18"/>
         </w:rPr>
-        <w:t xml:space="preserve">Client distribution and bundle-adoption (65%) are estimates — the model recalculates instantly as real numbers replace them.</w:t>
+        <w:t xml:space="preserve">Client counts are yours; avg units/client and bundle-adoption (65%) are estimates — the model recalculates instantly as real numbers replace them.</w:t>
       </w:r>
     </w:p>
     <w:p>
@@ -2214,7 +2226,7 @@
                 <w:sz w:val="19"/>
                 <w:szCs w:val="19"/>
               </w:rPr>
-              <w:t xml:space="preserve">$17.44</w:t>
+              <w:t xml:space="preserve">$15.44</w:t>
             </w:r>
           </w:p>
         </w:tc>
@@ -2258,7 +2270,7 @@
                 <w:sz w:val="19"/>
                 <w:szCs w:val="19"/>
               </w:rPr>
-              <w:t xml:space="preserve">4.5</w:t>
+              <w:t xml:space="preserve">4.4</w:t>
             </w:r>
           </w:p>
         </w:tc>
@@ -2352,7 +2364,7 @@
                 <w:sz w:val="19"/>
                 <w:szCs w:val="19"/>
               </w:rPr>
-              <w:t xml:space="preserve">$62</w:t>
+              <w:t xml:space="preserve">$52</w:t>
             </w:r>
           </w:p>
         </w:tc>
@@ -2490,7 +2502,7 @@
                 <w:sz w:val="19"/>
                 <w:szCs w:val="19"/>
               </w:rPr>
-              <w:t xml:space="preserve">$13.83</w:t>
+              <w:t xml:space="preserve">$11.90</w:t>
             </w:r>
           </w:p>
         </w:tc>
@@ -2582,7 +2594,7 @@
                 <w:sz w:val="19"/>
                 <w:szCs w:val="19"/>
               </w:rPr>
-              <w:t xml:space="preserve">79%</w:t>
+              <w:t xml:space="preserve">77%</w:t>
             </w:r>
           </w:p>
         </w:tc>
@@ -2626,7 +2638,7 @@
                 <w:sz w:val="19"/>
                 <w:szCs w:val="19"/>
               </w:rPr>
-              <w:t xml:space="preserve">$2,066</w:t>
+              <w:t xml:space="preserve">$1,739</w:t>
             </w:r>
           </w:p>
         </w:tc>
@@ -2720,7 +2732,7 @@
                 <w:sz w:val="19"/>
                 <w:szCs w:val="19"/>
               </w:rPr>
-              <w:t xml:space="preserve">13.8x</w:t>
+              <w:t xml:space="preserve">11.6x</w:t>
             </w:r>
           </w:p>
         </w:tc>
@@ -2736,7 +2748,7 @@
         <w:spacing w:after="120"/>
       </w:pPr>
       <w:r>
-        <w:t xml:space="preserve">A ~79% gross margin and ~14x LTV:CAC put Condo Assistant firmly in venture-grade SaaS territory. Every dollar of acquisition spend returns roughly fourteen over the customer lifetime.</w:t>
+        <w:t xml:space="preserve">A ~77% gross margin and ~11.6x LTV:CAC put Condo Assistant firmly in venture-grade SaaS territory. Every dollar of acquisition spend returns roughly twelve over the customer lifetime.</w:t>
       </w:r>
     </w:p>
     <w:p>
@@ -3119,7 +3131,7 @@
                 <w:sz w:val="19"/>
                 <w:szCs w:val="19"/>
               </w:rPr>
-              <w:t xml:space="preserve">~$469K</w:t>
+              <w:t xml:space="preserve">~$406K</w:t>
             </w:r>
           </w:p>
         </w:tc>
@@ -3212,7 +3224,7 @@
                 <w:sz w:val="19"/>
                 <w:szCs w:val="19"/>
               </w:rPr>
-              <w:t xml:space="preserve">~$1.88M</w:t>
+              <w:t xml:space="preserve">~$1.63M</w:t>
             </w:r>
           </w:p>
         </w:tc>
@@ -3281,7 +3293,7 @@
                 <w:sz w:val="19"/>
                 <w:szCs w:val="19"/>
               </w:rPr>
-              <w:t xml:space="preserve">5,000</w:t>
+              <w:t xml:space="preserve">5,050</w:t>
             </w:r>
           </w:p>
         </w:tc>
@@ -3303,7 +3315,7 @@
                 <w:sz w:val="19"/>
                 <w:szCs w:val="19"/>
               </w:rPr>
-              <w:t xml:space="preserve">~$4.69M</w:t>
+              <w:t xml:space="preserve">~$4.1M</w:t>
             </w:r>
           </w:p>
         </w:tc>

</xml_diff>

<commit_message>
Condo Assistant: smooth pricing cliff with $500/mo cap; small-owner priority + PM-channel strategy (~$4.42M ARR)
Co-Authored-By: Claude Opus 4.8 <noreply@anthropic.com>
</commit_message>
<xml_diff>
--- a/project_files/Condo_Assistant_Business_Plan.docx
+++ b/project_files/Condo_Assistant_Business_Plan.docx
@@ -140,7 +140,19 @@
         <w:spacing w:after="120"/>
       </w:pPr>
       <w:r>
-        <w:t xml:space="preserve">This plan targets ~5,050 VRBO clients. At full penetration the model produces roughly $4.1M in annual recurring revenue at a ~77% gross margin, with best-in-class unit economics (LTV:CAC ~11.6x). Below are the product, pricing, revenue model, unit economics, and three rollout options.</w:t>
+        <w:t xml:space="preserve">This plan targets ~5,050 VRBO clients. At full penetration the model produces roughly $4.4M in annual recurring revenue at a ~78% gross margin, with best-in-class unit economics (LTV:CAC ~12.7x). Below are the product, pricing, revenue model, unit economics, and three rollout options.</w:t>
+      </w:r>
+    </w:p>
+    <w:p>
+      <w:pPr>
+        <w:spacing w:after="120"/>
+      </w:pPr>
+      <w:r>
+        <w:rPr>
+          <w:i/>
+          <w:iCs/>
+        </w:rPr>
+        <w:t xml:space="preserve">Strategy note: the priority is the under-5-unit owner — the biggest, most profitable-per-unit segment (4,000 of 5,050 clients). Large property managers are priced aggressively (a monthly cap) on purpose: their adoption and referrals make those small, high-margin owners cheaper and easier to land.</w:t>
       </w:r>
     </w:p>
     <w:p>
@@ -275,11 +287,10 @@
         </w:tblBorders>
       </w:tblPr>
       <w:tblGrid>
-        <w:gridCol w:w="1900"/>
-        <w:gridCol w:w="1700"/>
-        <w:gridCol w:w="1500"/>
-        <w:gridCol w:w="1760"/>
-        <w:gridCol w:w="2500"/>
+        <w:gridCol w:w="2760"/>
+        <w:gridCol w:w="2200"/>
+        <w:gridCol w:w="2200"/>
+        <w:gridCol w:w="2200"/>
       </w:tblGrid>
       <w:tr>
         <w:trPr>
@@ -287,7 +298,7 @@
         </w:trPr>
         <w:tc>
           <w:tcPr>
-            <w:tcW w:type="dxa" w:w="1900"/>
+            <w:tcW w:type="dxa" w:w="2760"/>
             <w:shd w:fill="1F3864" w:val="clear"/>
             <w:tcMar>
               <w:top w:type="dxa" w:w="60"/>
@@ -311,7 +322,7 @@
         </w:tc>
         <w:tc>
           <w:tcPr>
-            <w:tcW w:type="dxa" w:w="1700"/>
+            <w:tcW w:type="dxa" w:w="2200"/>
             <w:shd w:fill="1F3864" w:val="clear"/>
             <w:tcMar>
               <w:top w:type="dxa" w:w="60"/>
@@ -335,7 +346,7 @@
         </w:tc>
         <w:tc>
           <w:tcPr>
-            <w:tcW w:type="dxa" w:w="1500"/>
+            <w:tcW w:type="dxa" w:w="2200"/>
             <w:shd w:fill="1F3864" w:val="clear"/>
             <w:tcMar>
               <w:top w:type="dxa" w:w="60"/>
@@ -359,7 +370,7 @@
         </w:tc>
         <w:tc>
           <w:tcPr>
-            <w:tcW w:type="dxa" w:w="1760"/>
+            <w:tcW w:type="dxa" w:w="2200"/>
             <w:shd w:fill="1F3864" w:val="clear"/>
             <w:tcMar>
               <w:top w:type="dxa" w:w="60"/>
@@ -381,35 +392,11 @@
             </w:r>
           </w:p>
         </w:tc>
-        <w:tc>
-          <w:tcPr>
-            <w:tcW w:type="dxa" w:w="2500"/>
-            <w:shd w:fill="1F3864" w:val="clear"/>
-            <w:tcMar>
-              <w:top w:type="dxa" w:w="60"/>
-              <w:left w:type="dxa" w:w="90"/>
-              <w:bottom w:type="dxa" w:w="60"/>
-              <w:right w:type="dxa" w:w="90"/>
-            </w:tcMar>
-          </w:tcPr>
-          <w:p>
-            <w:r>
-              <w:rPr>
-                <w:b/>
-                <w:bCs/>
-                <w:color w:val="FFFFFF"/>
-                <w:sz w:val="19"/>
-                <w:szCs w:val="19"/>
-              </w:rPr>
-              <w:t xml:space="preserve">Notes</w:t>
-            </w:r>
-          </w:p>
-        </w:tc>
       </w:tr>
       <w:tr>
         <w:tc>
           <w:tcPr>
-            <w:tcW w:type="dxa" w:w="1900"/>
+            <w:tcW w:type="dxa" w:w="2760"/>
             <w:tcMar>
               <w:top w:type="dxa" w:w="60"/>
               <w:left w:type="dxa" w:w="90"/>
@@ -431,7 +418,7 @@
         </w:tc>
         <w:tc>
           <w:tcPr>
-            <w:tcW w:type="dxa" w:w="1700"/>
+            <w:tcW w:type="dxa" w:w="2200"/>
             <w:tcMar>
               <w:top w:type="dxa" w:w="60"/>
               <w:left w:type="dxa" w:w="90"/>
@@ -453,7 +440,7 @@
         </w:tc>
         <w:tc>
           <w:tcPr>
-            <w:tcW w:type="dxa" w:w="1500"/>
+            <w:tcW w:type="dxa" w:w="2200"/>
             <w:tcMar>
               <w:top w:type="dxa" w:w="60"/>
               <w:left w:type="dxa" w:w="90"/>
@@ -475,45 +462,23 @@
         </w:tc>
         <w:tc>
           <w:tcPr>
-            <w:tcW w:type="dxa" w:w="1760"/>
-            <w:tcMar>
-              <w:top w:type="dxa" w:w="60"/>
-              <w:left w:type="dxa" w:w="90"/>
-              <w:bottom w:type="dxa" w:w="60"/>
-              <w:right w:type="dxa" w:w="90"/>
-            </w:tcMar>
-          </w:tcPr>
-          <w:p>
-            <w:r>
-              <w:rPr>
-                <w:b w:val="false"/>
-                <w:bCs w:val="false"/>
-                <w:sz w:val="19"/>
-                <w:szCs w:val="19"/>
-              </w:rPr>
-              <w:t xml:space="preserve">$25.00</w:t>
-            </w:r>
-          </w:p>
-        </w:tc>
-        <w:tc>
-          <w:tcPr>
-            <w:tcW w:type="dxa" w:w="2500"/>
-            <w:tcMar>
-              <w:top w:type="dxa" w:w="60"/>
-              <w:left w:type="dxa" w:w="90"/>
-              <w:bottom w:type="dxa" w:w="60"/>
-              <w:right w:type="dxa" w:w="90"/>
-            </w:tcMar>
-          </w:tcPr>
-          <w:p>
-            <w:r>
-              <w:rPr>
-                <w:b w:val="false"/>
-                <w:bCs w:val="false"/>
-                <w:sz w:val="19"/>
-                <w:szCs w:val="19"/>
-              </w:rPr>
-              <w:t xml:space="preserve">—</w:t>
+            <w:tcW w:type="dxa" w:w="2200"/>
+            <w:tcMar>
+              <w:top w:type="dxa" w:w="60"/>
+              <w:left w:type="dxa" w:w="90"/>
+              <w:bottom w:type="dxa" w:w="60"/>
+              <w:right w:type="dxa" w:w="90"/>
+            </w:tcMar>
+          </w:tcPr>
+          <w:p>
+            <w:r>
+              <w:rPr>
+                <w:b w:val="false"/>
+                <w:bCs w:val="false"/>
+                <w:sz w:val="19"/>
+                <w:szCs w:val="19"/>
+              </w:rPr>
+              <w:t xml:space="preserve">$25.00 / unit</w:t>
             </w:r>
           </w:p>
         </w:tc>
@@ -521,7 +486,7 @@
       <w:tr>
         <w:tc>
           <w:tcPr>
-            <w:tcW w:type="dxa" w:w="1900"/>
+            <w:tcW w:type="dxa" w:w="2760"/>
             <w:shd w:fill="F2F6FC" w:val="clear"/>
             <w:tcMar>
               <w:top w:type="dxa" w:w="60"/>
@@ -544,7 +509,7 @@
         </w:tc>
         <w:tc>
           <w:tcPr>
-            <w:tcW w:type="dxa" w:w="1700"/>
+            <w:tcW w:type="dxa" w:w="2200"/>
             <w:shd w:fill="F2F6FC" w:val="clear"/>
             <w:tcMar>
               <w:top w:type="dxa" w:w="60"/>
@@ -567,7 +532,7 @@
         </w:tc>
         <w:tc>
           <w:tcPr>
-            <w:tcW w:type="dxa" w:w="1500"/>
+            <w:tcW w:type="dxa" w:w="2200"/>
             <w:shd w:fill="F2F6FC" w:val="clear"/>
             <w:tcMar>
               <w:top w:type="dxa" w:w="60"/>
@@ -590,47 +555,24 @@
         </w:tc>
         <w:tc>
           <w:tcPr>
-            <w:tcW w:type="dxa" w:w="1760"/>
-            <w:shd w:fill="F2F6FC" w:val="clear"/>
-            <w:tcMar>
-              <w:top w:type="dxa" w:w="60"/>
-              <w:left w:type="dxa" w:w="90"/>
-              <w:bottom w:type="dxa" w:w="60"/>
-              <w:right w:type="dxa" w:w="90"/>
-            </w:tcMar>
-          </w:tcPr>
-          <w:p>
-            <w:r>
-              <w:rPr>
-                <w:b w:val="false"/>
-                <w:bCs w:val="false"/>
-                <w:sz w:val="19"/>
-                <w:szCs w:val="19"/>
-              </w:rPr>
-              <w:t xml:space="preserve">$22.00</w:t>
-            </w:r>
-          </w:p>
-        </w:tc>
-        <w:tc>
-          <w:tcPr>
-            <w:tcW w:type="dxa" w:w="2500"/>
-            <w:shd w:fill="F2F6FC" w:val="clear"/>
-            <w:tcMar>
-              <w:top w:type="dxa" w:w="60"/>
-              <w:left w:type="dxa" w:w="90"/>
-              <w:bottom w:type="dxa" w:w="60"/>
-              <w:right w:type="dxa" w:w="90"/>
-            </w:tcMar>
-          </w:tcPr>
-          <w:p>
-            <w:r>
-              <w:rPr>
-                <w:b w:val="false"/>
-                <w:bCs w:val="false"/>
-                <w:sz w:val="19"/>
-                <w:szCs w:val="19"/>
-              </w:rPr>
-              <w:t xml:space="preserve">~12% off</w:t>
+            <w:tcW w:type="dxa" w:w="2200"/>
+            <w:shd w:fill="F2F6FC" w:val="clear"/>
+            <w:tcMar>
+              <w:top w:type="dxa" w:w="60"/>
+              <w:left w:type="dxa" w:w="90"/>
+              <w:bottom w:type="dxa" w:w="60"/>
+              <w:right w:type="dxa" w:w="90"/>
+            </w:tcMar>
+          </w:tcPr>
+          <w:p>
+            <w:r>
+              <w:rPr>
+                <w:b w:val="false"/>
+                <w:bCs w:val="false"/>
+                <w:sz w:val="19"/>
+                <w:szCs w:val="19"/>
+              </w:rPr>
+              <w:t xml:space="preserve">$22.00 / unit</w:t>
             </w:r>
           </w:p>
         </w:tc>
@@ -638,29 +580,29 @@
       <w:tr>
         <w:tc>
           <w:tcPr>
-            <w:tcW w:type="dxa" w:w="1900"/>
-            <w:tcMar>
-              <w:top w:type="dxa" w:w="60"/>
-              <w:left w:type="dxa" w:w="90"/>
-              <w:bottom w:type="dxa" w:w="60"/>
-              <w:right w:type="dxa" w:w="90"/>
-            </w:tcMar>
-          </w:tcPr>
-          <w:p>
-            <w:r>
-              <w:rPr>
-                <w:b w:val="false"/>
-                <w:bCs w:val="false"/>
-                <w:sz w:val="19"/>
-                <w:szCs w:val="19"/>
-              </w:rPr>
-              <w:t xml:space="preserve">10–19 units</w:t>
-            </w:r>
-          </w:p>
-        </w:tc>
-        <w:tc>
-          <w:tcPr>
-            <w:tcW w:type="dxa" w:w="1700"/>
+            <w:tcW w:type="dxa" w:w="2760"/>
+            <w:tcMar>
+              <w:top w:type="dxa" w:w="60"/>
+              <w:left w:type="dxa" w:w="90"/>
+              <w:bottom w:type="dxa" w:w="60"/>
+              <w:right w:type="dxa" w:w="90"/>
+            </w:tcMar>
+          </w:tcPr>
+          <w:p>
+            <w:r>
+              <w:rPr>
+                <w:b w:val="false"/>
+                <w:bCs w:val="false"/>
+                <w:sz w:val="19"/>
+                <w:szCs w:val="19"/>
+              </w:rPr>
+              <w:t xml:space="preserve">10+ units</w:t>
+            </w:r>
+          </w:p>
+        </w:tc>
+        <w:tc>
+          <w:tcPr>
+            <w:tcW w:type="dxa" w:w="2200"/>
             <w:tcMar>
               <w:top w:type="dxa" w:w="60"/>
               <w:left w:type="dxa" w:w="90"/>
@@ -682,7 +624,7 @@
         </w:tc>
         <w:tc>
           <w:tcPr>
-            <w:tcW w:type="dxa" w:w="1500"/>
+            <w:tcW w:type="dxa" w:w="2200"/>
             <w:tcMar>
               <w:top w:type="dxa" w:w="60"/>
               <w:left w:type="dxa" w:w="90"/>
@@ -704,274 +646,23 @@
         </w:tc>
         <w:tc>
           <w:tcPr>
-            <w:tcW w:type="dxa" w:w="1760"/>
-            <w:tcMar>
-              <w:top w:type="dxa" w:w="60"/>
-              <w:left w:type="dxa" w:w="90"/>
-              <w:bottom w:type="dxa" w:w="60"/>
-              <w:right w:type="dxa" w:w="90"/>
-            </w:tcMar>
-          </w:tcPr>
-          <w:p>
-            <w:r>
-              <w:rPr>
-                <w:b w:val="false"/>
-                <w:bCs w:val="false"/>
-                <w:sz w:val="19"/>
-                <w:szCs w:val="19"/>
-              </w:rPr>
-              <w:t xml:space="preserve">$20.00</w:t>
-            </w:r>
-          </w:p>
-        </w:tc>
-        <w:tc>
-          <w:tcPr>
-            <w:tcW w:type="dxa" w:w="2500"/>
-            <w:tcMar>
-              <w:top w:type="dxa" w:w="60"/>
-              <w:left w:type="dxa" w:w="90"/>
-              <w:bottom w:type="dxa" w:w="60"/>
-              <w:right w:type="dxa" w:w="90"/>
-            </w:tcMar>
-          </w:tcPr>
-          <w:p>
-            <w:r>
-              <w:rPr>
-                <w:b w:val="false"/>
-                <w:bCs w:val="false"/>
-                <w:sz w:val="19"/>
-                <w:szCs w:val="19"/>
-              </w:rPr>
-              <w:t xml:space="preserve">20% off</w:t>
-            </w:r>
-          </w:p>
-        </w:tc>
-      </w:tr>
-      <w:tr>
-        <w:tc>
-          <w:tcPr>
-            <w:tcW w:type="dxa" w:w="1900"/>
-            <w:shd w:fill="F2F6FC" w:val="clear"/>
-            <w:tcMar>
-              <w:top w:type="dxa" w:w="60"/>
-              <w:left w:type="dxa" w:w="90"/>
-              <w:bottom w:type="dxa" w:w="60"/>
-              <w:right w:type="dxa" w:w="90"/>
-            </w:tcMar>
-          </w:tcPr>
-          <w:p>
-            <w:r>
-              <w:rPr>
-                <w:b w:val="false"/>
-                <w:bCs w:val="false"/>
-                <w:sz w:val="19"/>
-                <w:szCs w:val="19"/>
-              </w:rPr>
-              <w:t xml:space="preserve">20–49 units</w:t>
-            </w:r>
-          </w:p>
-        </w:tc>
-        <w:tc>
-          <w:tcPr>
-            <w:tcW w:type="dxa" w:w="1700"/>
-            <w:shd w:fill="F2F6FC" w:val="clear"/>
-            <w:tcMar>
-              <w:top w:type="dxa" w:w="60"/>
-              <w:left w:type="dxa" w:w="90"/>
-              <w:bottom w:type="dxa" w:w="60"/>
-              <w:right w:type="dxa" w:w="90"/>
-            </w:tcMar>
-          </w:tcPr>
-          <w:p>
-            <w:r>
-              <w:rPr>
-                <w:b w:val="false"/>
-                <w:bCs w:val="false"/>
-                <w:sz w:val="19"/>
-                <w:szCs w:val="19"/>
-              </w:rPr>
-              <w:t xml:space="preserve">$9.00</w:t>
-            </w:r>
-          </w:p>
-        </w:tc>
-        <w:tc>
-          <w:tcPr>
-            <w:tcW w:type="dxa" w:w="1500"/>
-            <w:shd w:fill="F2F6FC" w:val="clear"/>
-            <w:tcMar>
-              <w:top w:type="dxa" w:w="60"/>
-              <w:left w:type="dxa" w:w="90"/>
-              <w:bottom w:type="dxa" w:w="60"/>
-              <w:right w:type="dxa" w:w="90"/>
-            </w:tcMar>
-          </w:tcPr>
-          <w:p>
-            <w:r>
-              <w:rPr>
-                <w:b w:val="false"/>
-                <w:bCs w:val="false"/>
-                <w:sz w:val="19"/>
-                <w:szCs w:val="19"/>
-              </w:rPr>
-              <w:t xml:space="preserve">$9.00</w:t>
-            </w:r>
-          </w:p>
-        </w:tc>
-        <w:tc>
-          <w:tcPr>
-            <w:tcW w:type="dxa" w:w="1760"/>
-            <w:shd w:fill="F2F6FC" w:val="clear"/>
-            <w:tcMar>
-              <w:top w:type="dxa" w:w="60"/>
-              <w:left w:type="dxa" w:w="90"/>
-              <w:bottom w:type="dxa" w:w="60"/>
-              <w:right w:type="dxa" w:w="90"/>
-            </w:tcMar>
-          </w:tcPr>
-          <w:p>
-            <w:r>
-              <w:rPr>
-                <w:b w:val="false"/>
-                <w:bCs w:val="false"/>
-                <w:sz w:val="19"/>
-                <w:szCs w:val="19"/>
-              </w:rPr>
-              <w:t xml:space="preserve">$14.00</w:t>
-            </w:r>
-          </w:p>
-        </w:tc>
-        <w:tc>
-          <w:tcPr>
-            <w:tcW w:type="dxa" w:w="2500"/>
-            <w:shd w:fill="F2F6FC" w:val="clear"/>
-            <w:tcMar>
-              <w:top w:type="dxa" w:w="60"/>
-              <w:left w:type="dxa" w:w="90"/>
-              <w:bottom w:type="dxa" w:w="60"/>
-              <w:right w:type="dxa" w:w="90"/>
-            </w:tcMar>
-          </w:tcPr>
-          <w:p>
-            <w:r>
-              <w:rPr>
-                <w:b w:val="false"/>
-                <w:bCs w:val="false"/>
-                <w:sz w:val="19"/>
-                <w:szCs w:val="19"/>
-              </w:rPr>
-              <w:t xml:space="preserve">Bigger discount (~44%)</w:t>
-            </w:r>
-          </w:p>
-        </w:tc>
-      </w:tr>
-      <w:tr>
-        <w:tc>
-          <w:tcPr>
-            <w:tcW w:type="dxa" w:w="1900"/>
-            <w:tcMar>
-              <w:top w:type="dxa" w:w="60"/>
-              <w:left w:type="dxa" w:w="90"/>
-              <w:bottom w:type="dxa" w:w="60"/>
-              <w:right w:type="dxa" w:w="90"/>
-            </w:tcMar>
-          </w:tcPr>
-          <w:p>
-            <w:r>
-              <w:rPr>
-                <w:b w:val="false"/>
-                <w:bCs w:val="false"/>
-                <w:sz w:val="19"/>
-                <w:szCs w:val="19"/>
-              </w:rPr>
-              <w:t xml:space="preserve">50–100 units</w:t>
-            </w:r>
-          </w:p>
-        </w:tc>
-        <w:tc>
-          <w:tcPr>
-            <w:tcW w:type="dxa" w:w="1700"/>
-            <w:tcMar>
-              <w:top w:type="dxa" w:w="60"/>
-              <w:left w:type="dxa" w:w="90"/>
-              <w:bottom w:type="dxa" w:w="60"/>
-              <w:right w:type="dxa" w:w="90"/>
-            </w:tcMar>
-          </w:tcPr>
-          <w:p>
-            <w:r>
-              <w:rPr>
-                <w:b w:val="false"/>
-                <w:bCs w:val="false"/>
-                <w:sz w:val="19"/>
-                <w:szCs w:val="19"/>
-              </w:rPr>
-              <w:t xml:space="preserve">—</w:t>
-            </w:r>
-          </w:p>
-        </w:tc>
-        <w:tc>
-          <w:tcPr>
-            <w:tcW w:type="dxa" w:w="1500"/>
-            <w:tcMar>
-              <w:top w:type="dxa" w:w="60"/>
-              <w:left w:type="dxa" w:w="90"/>
-              <w:bottom w:type="dxa" w:w="60"/>
-              <w:right w:type="dxa" w:w="90"/>
-            </w:tcMar>
-          </w:tcPr>
-          <w:p>
-            <w:r>
-              <w:rPr>
-                <w:b w:val="false"/>
-                <w:bCs w:val="false"/>
-                <w:sz w:val="19"/>
-                <w:szCs w:val="19"/>
-              </w:rPr>
-              <w:t xml:space="preserve">—</w:t>
-            </w:r>
-          </w:p>
-        </w:tc>
-        <w:tc>
-          <w:tcPr>
-            <w:tcW w:type="dxa" w:w="1760"/>
-            <w:tcMar>
-              <w:top w:type="dxa" w:w="60"/>
-              <w:left w:type="dxa" w:w="90"/>
-              <w:bottom w:type="dxa" w:w="60"/>
-              <w:right w:type="dxa" w:w="90"/>
-            </w:tcMar>
-          </w:tcPr>
-          <w:p>
-            <w:r>
-              <w:rPr>
-                <w:b w:val="false"/>
-                <w:bCs w:val="false"/>
-                <w:sz w:val="19"/>
-                <w:szCs w:val="19"/>
-              </w:rPr>
-              <w:t xml:space="preserve">FLAT $500/mo</w:t>
-            </w:r>
-          </w:p>
-        </w:tc>
-        <w:tc>
-          <w:tcPr>
-            <w:tcW w:type="dxa" w:w="2500"/>
-            <w:tcMar>
-              <w:top w:type="dxa" w:w="60"/>
-              <w:left w:type="dxa" w:w="90"/>
-              <w:bottom w:type="dxa" w:w="60"/>
-              <w:right w:type="dxa" w:w="90"/>
-            </w:tcMar>
-          </w:tcPr>
-          <w:p>
-            <w:r>
-              <w:rPr>
-                <w:b w:val="false"/>
-                <w:bCs w:val="false"/>
-                <w:sz w:val="19"/>
-                <w:szCs w:val="19"/>
-              </w:rPr>
-              <w:t xml:space="preserve">Enterprise (≈$6.67/unit)</w:t>
+            <w:tcW w:type="dxa" w:w="2200"/>
+            <w:tcMar>
+              <w:top w:type="dxa" w:w="60"/>
+              <w:left w:type="dxa" w:w="90"/>
+              <w:bottom w:type="dxa" w:w="60"/>
+              <w:right w:type="dxa" w:w="90"/>
+            </w:tcMar>
+          </w:tcPr>
+          <w:p>
+            <w:r>
+              <w:rPr>
+                <w:b w:val="false"/>
+                <w:bCs w:val="false"/>
+                <w:sz w:val="19"/>
+                <w:szCs w:val="19"/>
+              </w:rPr>
+              <w:t xml:space="preserve">$20.00 / unit</w:t>
             </w:r>
           </w:p>
         </w:tc>
@@ -983,10 +674,25 @@
       </w:pPr>
       <w:r>
         <w:rPr>
+          <w:b/>
+          <w:bCs/>
+          <w:color w:val="1F3864"/>
+          <w:sz w:val="22"/>
+          <w:szCs w:val="22"/>
+        </w:rPr>
+        <w:t xml:space="preserve">Monthly cap: $500 per client, up to 100 units (100+ = custom).</w:t>
+      </w:r>
+    </w:p>
+    <w:p>
+      <w:pPr>
+        <w:spacing w:after="120"/>
+      </w:pPr>
+      <w:r>
+        <w:rPr>
           <w:sz w:val="20"/>
           <w:szCs w:val="20"/>
         </w:rPr>
-        <w:t xml:space="preserve">Enterprise clients (50–100 units) pay a flat $500/month — a deep per-unit discount that makes Condo Assistant a no-brainer for property-management companies. 100+ units is a custom quote.</w:t>
+        <w:t xml:space="preserve">The cap smooths the price curve — a client's bill rises with units, then plateaus at $500 and never drops as they add more. This delivers a deep effective discount to large managers (a 75-unit client pays ≈$6.67/unit) while keeping the small owner at full price.</w:t>
       </w:r>
     </w:p>
     <w:p>
@@ -1165,7 +871,7 @@
                 <w:sz w:val="19"/>
                 <w:szCs w:val="19"/>
               </w:rPr>
-              <w:t xml:space="preserve">Pricing</w:t>
+              <w:t xml:space="preserve">Bill/Client/mo</w:t>
             </w:r>
           </w:p>
         </w:tc>
@@ -1301,7 +1007,7 @@
                 <w:sz w:val="19"/>
                 <w:szCs w:val="19"/>
               </w:rPr>
-              <w:t xml:space="preserve">per-unit</w:t>
+              <w:t xml:space="preserve">$32</w:t>
             </w:r>
           </w:p>
         </w:tc>
@@ -1440,7 +1146,7 @@
                 <w:sz w:val="19"/>
                 <w:szCs w:val="19"/>
               </w:rPr>
-              <w:t xml:space="preserve">per-unit</w:t>
+              <w:t xml:space="preserve">$95</w:t>
             </w:r>
           </w:p>
         </w:tc>
@@ -1575,7 +1281,7 @@
                 <w:sz w:val="19"/>
                 <w:szCs w:val="19"/>
               </w:rPr>
-              <w:t xml:space="preserve">per-unit</w:t>
+              <w:t xml:space="preserve">$224</w:t>
             </w:r>
           </w:p>
         </w:tc>
@@ -1714,7 +1420,7 @@
                 <w:sz w:val="19"/>
                 <w:szCs w:val="19"/>
               </w:rPr>
-              <w:t xml:space="preserve">per-unit</w:t>
+              <w:t xml:space="preserve">$500 (cap)</w:t>
             </w:r>
           </w:p>
         </w:tc>
@@ -1737,7 +1443,7 @@
                 <w:sz w:val="19"/>
                 <w:szCs w:val="19"/>
               </w:rPr>
-              <w:t xml:space="preserve">$73,500</w:t>
+              <w:t xml:space="preserve">$100,000</w:t>
             </w:r>
           </w:p>
         </w:tc>
@@ -1849,7 +1555,7 @@
                 <w:sz w:val="19"/>
                 <w:szCs w:val="19"/>
               </w:rPr>
-              <w:t xml:space="preserve">flat $500</w:t>
+              <w:t xml:space="preserve">$500 (cap)</w:t>
             </w:r>
           </w:p>
         </w:tc>
@@ -2011,7 +1717,7 @@
                 <w:sz w:val="19"/>
                 <w:szCs w:val="19"/>
               </w:rPr>
-              <w:t xml:space="preserve">$341,924</w:t>
+              <w:t xml:space="preserve">$368,424</w:t>
             </w:r>
           </w:p>
         </w:tc>
@@ -2034,7 +1740,7 @@
           <w:sz w:val="24"/>
           <w:szCs w:val="24"/>
         </w:rPr>
-        <w:t xml:space="preserve">Annual Recurring Revenue at full penetration: ~$4.1M.</w:t>
+        <w:t xml:space="preserve">Annual Recurring Revenue at full penetration: ~$4.4M.</w:t>
       </w:r>
     </w:p>
     <w:p>
@@ -2226,7 +1932,7 @@
                 <w:sz w:val="19"/>
                 <w:szCs w:val="19"/>
               </w:rPr>
-              <w:t xml:space="preserve">$15.44</w:t>
+              <w:t xml:space="preserve">$16.63</w:t>
             </w:r>
           </w:p>
         </w:tc>
@@ -2364,7 +2070,7 @@
                 <w:sz w:val="19"/>
                 <w:szCs w:val="19"/>
               </w:rPr>
-              <w:t xml:space="preserve">$52</w:t>
+              <w:t xml:space="preserve">$57</w:t>
             </w:r>
           </w:p>
         </w:tc>
@@ -2502,7 +2208,7 @@
                 <w:sz w:val="19"/>
                 <w:szCs w:val="19"/>
               </w:rPr>
-              <w:t xml:space="preserve">$11.90</w:t>
+              <w:t xml:space="preserve">$13.05</w:t>
             </w:r>
           </w:p>
         </w:tc>
@@ -2594,7 +2300,7 @@
                 <w:sz w:val="19"/>
                 <w:szCs w:val="19"/>
               </w:rPr>
-              <w:t xml:space="preserve">77%</w:t>
+              <w:t xml:space="preserve">78%</w:t>
             </w:r>
           </w:p>
         </w:tc>
@@ -2638,7 +2344,7 @@
                 <w:sz w:val="19"/>
                 <w:szCs w:val="19"/>
               </w:rPr>
-              <w:t xml:space="preserve">$1,739</w:t>
+              <w:t xml:space="preserve">$1,908</w:t>
             </w:r>
           </w:p>
         </w:tc>
@@ -2732,7 +2438,7 @@
                 <w:sz w:val="19"/>
                 <w:szCs w:val="19"/>
               </w:rPr>
-              <w:t xml:space="preserve">11.6x</w:t>
+              <w:t xml:space="preserve">12.7x</w:t>
             </w:r>
           </w:p>
         </w:tc>
@@ -2748,7 +2454,7 @@
         <w:spacing w:after="120"/>
       </w:pPr>
       <w:r>
-        <w:t xml:space="preserve">A ~77% gross margin and ~11.6x LTV:CAC put Condo Assistant firmly in venture-grade SaaS territory. Every dollar of acquisition spend returns roughly twelve over the customer lifetime.</w:t>
+        <w:t xml:space="preserve">A ~78% gross margin and ~12.7x LTV:CAC put Condo Assistant firmly in venture-grade SaaS territory. Every dollar of acquisition spend returns roughly thirteen over the customer lifetime.</w:t>
       </w:r>
     </w:p>
     <w:p>
@@ -3131,7 +2837,7 @@
                 <w:sz w:val="19"/>
                 <w:szCs w:val="19"/>
               </w:rPr>
-              <w:t xml:space="preserve">~$406K</w:t>
+              <w:t xml:space="preserve">~$438K</w:t>
             </w:r>
           </w:p>
         </w:tc>
@@ -3153,7 +2859,7 @@
                 <w:sz w:val="19"/>
                 <w:szCs w:val="19"/>
               </w:rPr>
-              <w:t xml:space="preserve">Option A — referrals + STR communities (prove it, near-zero CAC)</w:t>
+              <w:t xml:space="preserve">Option A — small owners via referrals + STR communities (near-zero CAC)</w:t>
             </w:r>
           </w:p>
         </w:tc>
@@ -3224,7 +2930,7 @@
                 <w:sz w:val="19"/>
                 <w:szCs w:val="19"/>
               </w:rPr>
-              <w:t xml:space="preserve">~$1.63M</w:t>
+              <w:t xml:space="preserve">~$1.75M</w:t>
             </w:r>
           </w:p>
         </w:tc>
@@ -3247,7 +2953,7 @@
                 <w:sz w:val="19"/>
                 <w:szCs w:val="19"/>
               </w:rPr>
-              <w:t xml:space="preserve">Add Option C — PM/software partners + affiliates</w:t>
+              <w:t xml:space="preserve">Add Option C — land PM companies who refer &amp; credential small owners</w:t>
             </w:r>
           </w:p>
         </w:tc>
@@ -3315,7 +3021,7 @@
                 <w:sz w:val="19"/>
                 <w:szCs w:val="19"/>
               </w:rPr>
-              <w:t xml:space="preserve">~$4.1M</w:t>
+              <w:t xml:space="preserve">~$4.4M</w:t>
             </w:r>
           </w:p>
         </w:tc>

</xml_diff>

<commit_message>
Condo Assistant plan: add visual dashboard as first page
Co-Authored-By: Claude Opus 4.8 <noreply@anthropic.com>
</commit_message>
<xml_diff>
--- a/project_files/Condo_Assistant_Business_Plan.docx
+++ b/project_files/Condo_Assistant_Business_Plan.docx
@@ -4,7 +4,7 @@
   <w:body>
     <w:p>
       <w:pPr>
-        <w:spacing w:before="2600"/>
+        <w:spacing w:before="200"/>
         <w:jc w:val="center"/>
       </w:pPr>
       <w:r>
@@ -12,8 +12,8 @@
           <w:b/>
           <w:bCs/>
           <w:color w:val="1F3864"/>
-          <w:sz w:val="56"/>
-          <w:szCs w:val="56"/>
+          <w:sz w:val="50"/>
+          <w:szCs w:val="50"/>
         </w:rPr>
         <w:t xml:space="preserve">CONDO ASSISTANT</w:t>
       </w:r>
@@ -21,91 +21,510 @@
     <w:p>
       <w:pPr>
         <w:pBdr>
-          <w:bottom w:val="single" w:color="2E74B5" w:sz="12" w:space="8"/>
+          <w:bottom w:val="single" w:color="2E74B5" w:sz="12" w:space="6"/>
         </w:pBdr>
-        <w:spacing w:after="60"/>
+        <w:spacing w:after="50"/>
         <w:jc w:val="center"/>
       </w:pPr>
       <w:r>
         <w:rPr>
-          <w:sz w:val="8"/>
-          <w:szCs w:val="8"/>
+          <w:sz w:val="6"/>
+          <w:szCs w:val="6"/>
         </w:rPr>
         <w:t xml:space="preserve"/>
       </w:r>
     </w:p>
     <w:p>
       <w:pPr>
-        <w:spacing w:before="160"/>
+        <w:spacing w:after="30" w:before="90"/>
         <w:jc w:val="center"/>
       </w:pPr>
       <w:r>
         <w:rPr>
+          <w:i/>
+          <w:iCs/>
           <w:color w:val="2E74B5"/>
-          <w:sz w:val="32"/>
-          <w:szCs w:val="32"/>
-        </w:rPr>
-        <w:t xml:space="preserve">SaaS Business Plan &amp; Rollout</w:t>
-      </w:r>
-    </w:p>
-    <w:p>
-      <w:pPr>
-        <w:spacing w:before="120"/>
+          <w:sz w:val="24"/>
+          <w:szCs w:val="24"/>
+        </w:rPr>
+        <w:t xml:space="preserve">SaaS Business Plan — Snapshot for Alex</w:t>
+      </w:r>
+    </w:p>
+    <w:p>
+      <w:pPr>
+        <w:spacing w:after="160"/>
         <w:jc w:val="center"/>
+      </w:pPr>
+      <w:r>
+        <w:rPr>
+          <w:color w:val="777777"/>
+          <w:sz w:val="17"/>
+          <w:szCs w:val="17"/>
+        </w:rPr>
+        <w:t xml:space="preserve">July 2026 · Winter Park Management LLC (DBA Condo Assistant)</w:t>
+      </w:r>
+    </w:p>
+    <w:tbl>
+      <w:tblPr>
+        <w:tblW w:type="dxa" w:w="9360"/>
+        <w:tblBorders>
+          <w:top w:val="single" w:color="auto" w:sz="4"/>
+          <w:left w:val="single" w:color="auto" w:sz="4"/>
+          <w:bottom w:val="single" w:color="auto" w:sz="4"/>
+          <w:right w:val="single" w:color="auto" w:sz="4"/>
+          <w:insideH w:val="single" w:color="auto" w:sz="4"/>
+          <w:insideV w:val="single" w:color="auto" w:sz="4"/>
+        </w:tblBorders>
+      </w:tblPr>
+      <w:tblGrid>
+        <w:gridCol w:w="2340"/>
+        <w:gridCol w:w="2340"/>
+        <w:gridCol w:w="2340"/>
+        <w:gridCol w:w="2340"/>
+      </w:tblGrid>
+      <w:tr>
+        <w:tc>
+          <w:tcPr>
+            <w:tcW w:type="dxa" w:w="2340"/>
+            <w:shd w:fill="D9E1F2" w:val="clear"/>
+            <w:tcMar>
+              <w:top w:type="dxa" w:w="150"/>
+              <w:left w:type="dxa" w:w="70"/>
+              <w:bottom w:type="dxa" w:w="150"/>
+              <w:right w:type="dxa" w:w="70"/>
+            </w:tcMar>
+          </w:tcPr>
+          <w:p>
+            <w:pPr>
+              <w:spacing w:after="30"/>
+              <w:jc w:val="center"/>
+            </w:pPr>
+            <w:r>
+              <w:rPr>
+                <w:b/>
+                <w:bCs/>
+                <w:color w:val="1F3864"/>
+                <w:sz w:val="46"/>
+                <w:szCs w:val="46"/>
+              </w:rPr>
+              <w:t xml:space="preserve">$4.4M</w:t>
+            </w:r>
+          </w:p>
+          <w:p>
+            <w:pPr>
+              <w:jc w:val="center"/>
+            </w:pPr>
+            <w:r>
+              <w:rPr>
+                <w:color w:val="555555"/>
+                <w:sz w:val="17"/>
+                <w:szCs w:val="17"/>
+              </w:rPr>
+              <w:t xml:space="preserve">ARR at full scale</w:t>
+            </w:r>
+          </w:p>
+        </w:tc>
+        <w:tc>
+          <w:tcPr>
+            <w:tcW w:type="dxa" w:w="2340"/>
+            <w:shd w:fill="E2EFDA" w:val="clear"/>
+            <w:tcMar>
+              <w:top w:type="dxa" w:w="150"/>
+              <w:left w:type="dxa" w:w="70"/>
+              <w:bottom w:type="dxa" w:w="150"/>
+              <w:right w:type="dxa" w:w="70"/>
+            </w:tcMar>
+          </w:tcPr>
+          <w:p>
+            <w:pPr>
+              <w:spacing w:after="30"/>
+              <w:jc w:val="center"/>
+            </w:pPr>
+            <w:r>
+              <w:rPr>
+                <w:b/>
+                <w:bCs/>
+                <w:color w:val="2E7D32"/>
+                <w:sz w:val="46"/>
+                <w:szCs w:val="46"/>
+              </w:rPr>
+              <w:t xml:space="preserve">78%</w:t>
+            </w:r>
+          </w:p>
+          <w:p>
+            <w:pPr>
+              <w:jc w:val="center"/>
+            </w:pPr>
+            <w:r>
+              <w:rPr>
+                <w:color w:val="555555"/>
+                <w:sz w:val="17"/>
+                <w:szCs w:val="17"/>
+              </w:rPr>
+              <w:t xml:space="preserve">Gross margin</w:t>
+            </w:r>
+          </w:p>
+        </w:tc>
+        <w:tc>
+          <w:tcPr>
+            <w:tcW w:type="dxa" w:w="2340"/>
+            <w:shd w:fill="DDEBF7" w:val="clear"/>
+            <w:tcMar>
+              <w:top w:type="dxa" w:w="150"/>
+              <w:left w:type="dxa" w:w="70"/>
+              <w:bottom w:type="dxa" w:w="150"/>
+              <w:right w:type="dxa" w:w="70"/>
+            </w:tcMar>
+          </w:tcPr>
+          <w:p>
+            <w:pPr>
+              <w:spacing w:after="30"/>
+              <w:jc w:val="center"/>
+            </w:pPr>
+            <w:r>
+              <w:rPr>
+                <w:b/>
+                <w:bCs/>
+                <w:color w:val="1565C0"/>
+                <w:sz w:val="46"/>
+                <w:szCs w:val="46"/>
+              </w:rPr>
+              <w:t xml:space="preserve">12.7x</w:t>
+            </w:r>
+          </w:p>
+          <w:p>
+            <w:pPr>
+              <w:jc w:val="center"/>
+            </w:pPr>
+            <w:r>
+              <w:rPr>
+                <w:color w:val="555555"/>
+                <w:sz w:val="17"/>
+                <w:szCs w:val="17"/>
+              </w:rPr>
+              <w:t xml:space="preserve">LTV : CAC</w:t>
+            </w:r>
+          </w:p>
+        </w:tc>
+        <w:tc>
+          <w:tcPr>
+            <w:tcW w:type="dxa" w:w="2340"/>
+            <w:shd w:fill="FCE4D6" w:val="clear"/>
+            <w:tcMar>
+              <w:top w:type="dxa" w:w="150"/>
+              <w:left w:type="dxa" w:w="70"/>
+              <w:bottom w:type="dxa" w:w="150"/>
+              <w:right w:type="dxa" w:w="70"/>
+            </w:tcMar>
+          </w:tcPr>
+          <w:p>
+            <w:pPr>
+              <w:spacing w:after="30"/>
+              <w:jc w:val="center"/>
+            </w:pPr>
+            <w:r>
+              <w:rPr>
+                <w:b/>
+                <w:bCs/>
+                <w:color w:val="B26A00"/>
+                <w:sz w:val="46"/>
+                <w:szCs w:val="46"/>
+              </w:rPr>
+              <w:t xml:space="preserve">5,050</w:t>
+            </w:r>
+          </w:p>
+          <w:p>
+            <w:pPr>
+              <w:jc w:val="center"/>
+            </w:pPr>
+            <w:r>
+              <w:rPr>
+                <w:color w:val="555555"/>
+                <w:sz w:val="17"/>
+                <w:szCs w:val="17"/>
+              </w:rPr>
+              <w:t xml:space="preserve">Target clients</w:t>
+            </w:r>
+          </w:p>
+        </w:tc>
+      </w:tr>
+    </w:tbl>
+    <w:p>
+      <w:pPr>
+        <w:spacing w:after="60" w:before="180"/>
+      </w:pPr>
+      <w:r>
+        <w:rPr>
+          <w:b/>
+          <w:bCs/>
+          <w:caps/>
+          <w:color w:val="1F3864"/>
+          <w:sz w:val="20"/>
+          <w:szCs w:val="20"/>
+        </w:rPr>
+        <w:t xml:space="preserve">The Offer</w:t>
+      </w:r>
+    </w:p>
+    <w:p>
+      <w:pPr>
+        <w:spacing w:after="40"/>
+      </w:pPr>
+      <w:r>
+        <w:rPr>
+          <w:sz w:val="21"/>
+          <w:szCs w:val="21"/>
+        </w:rPr>
+        <w:t xml:space="preserve">Condo Assistant $15/unit  ·  Auto Email $15/unit  ·  Bundle (both) $25/unit</w:t>
+      </w:r>
+    </w:p>
+    <w:p>
+      <w:pPr>
+        <w:spacing w:after="40"/>
       </w:pPr>
       <w:r>
         <w:rPr>
           <w:i/>
           <w:iCs/>
           <w:color w:val="555555"/>
-          <w:sz w:val="24"/>
-          <w:szCs w:val="24"/>
-        </w:rPr>
-        <w:t xml:space="preserve">AI Concierge + Auto-Email for Short-Term Rentals</w:t>
-      </w:r>
-    </w:p>
-    <w:p>
-      <w:pPr>
-        <w:spacing w:before="2200"/>
-        <w:jc w:val="center"/>
+          <w:sz w:val="21"/>
+          <w:szCs w:val="21"/>
+        </w:rPr>
+        <w:t xml:space="preserve">Volume-friendly: capped at $500/month per client (up to 100 units) — the bill plateaus, never cliffs.</w:t>
+      </w:r>
+    </w:p>
+    <w:p>
+      <w:pPr>
+        <w:spacing w:after="60" w:before="180"/>
       </w:pPr>
       <w:r>
         <w:rPr>
           <w:b/>
           <w:bCs/>
-          <w:sz w:val="24"/>
-          <w:szCs w:val="24"/>
-        </w:rPr>
-        <w:t xml:space="preserve">Prepared for: Alex</w:t>
-      </w:r>
-    </w:p>
-    <w:p>
-      <w:pPr>
-        <w:spacing w:before="60"/>
-        <w:jc w:val="center"/>
-      </w:pPr>
-      <w:r>
-        <w:rPr>
+          <w:caps/>
+          <w:color w:val="1F3864"/>
           <w:sz w:val="20"/>
           <w:szCs w:val="20"/>
         </w:rPr>
-        <w:t xml:space="preserve">July 2026 · Winter Park Management LLC (DBA Condo Assistant)</w:t>
-      </w:r>
-    </w:p>
-    <w:p>
-      <w:pPr>
-        <w:spacing w:before="400"/>
-        <w:jc w:val="center"/>
+        <w:t xml:space="preserve">Rollout</w:t>
+      </w:r>
+    </w:p>
+    <w:tbl>
+      <w:tblPr>
+        <w:tblW w:type="dxa" w:w="9360"/>
+        <w:tblBorders>
+          <w:top w:val="single" w:color="auto" w:sz="4"/>
+          <w:left w:val="single" w:color="auto" w:sz="4"/>
+          <w:bottom w:val="single" w:color="auto" w:sz="4"/>
+          <w:right w:val="single" w:color="auto" w:sz="4"/>
+          <w:insideH w:val="single" w:color="auto" w:sz="4"/>
+          <w:insideV w:val="single" w:color="auto" w:sz="4"/>
+        </w:tblBorders>
+      </w:tblPr>
+      <w:tblGrid>
+        <w:gridCol w:w="3120"/>
+        <w:gridCol w:w="3120"/>
+        <w:gridCol w:w="3120"/>
+      </w:tblGrid>
+      <w:tr>
+        <w:tc>
+          <w:tcPr>
+            <w:tcW w:type="dxa" w:w="3120"/>
+            <w:shd w:fill="F2F6FC" w:val="clear"/>
+            <w:tcMar>
+              <w:top w:type="dxa" w:w="120"/>
+              <w:left w:type="dxa" w:w="90"/>
+              <w:bottom w:type="dxa" w:w="120"/>
+              <w:right w:type="dxa" w:w="90"/>
+            </w:tcMar>
+          </w:tcPr>
+          <w:p>
+            <w:pPr>
+              <w:spacing w:after="20"/>
+              <w:jc w:val="center"/>
+            </w:pPr>
+            <w:r>
+              <w:rPr>
+                <w:b/>
+                <w:bCs/>
+                <w:color w:val="1F3864"/>
+                <w:sz w:val="22"/>
+                <w:szCs w:val="22"/>
+              </w:rPr>
+              <w:t xml:space="preserve">Year 1</w:t>
+            </w:r>
+          </w:p>
+          <w:p>
+            <w:pPr>
+              <w:spacing w:after="20"/>
+              <w:jc w:val="center"/>
+            </w:pPr>
+            <w:r>
+              <w:rPr>
+                <w:b/>
+                <w:bCs/>
+                <w:color w:val="2E74B5"/>
+                <w:sz w:val="30"/>
+                <w:szCs w:val="30"/>
+              </w:rPr>
+              <w:t xml:space="preserve">500</w:t>
+            </w:r>
+          </w:p>
+          <w:p>
+            <w:pPr>
+              <w:jc w:val="center"/>
+            </w:pPr>
+            <w:r>
+              <w:rPr>
+                <w:color w:val="555555"/>
+                <w:sz w:val="16"/>
+                <w:szCs w:val="16"/>
+              </w:rPr>
+              <w:t xml:space="preserve">clients · ~$438K ARR — small owners via referrals</w:t>
+            </w:r>
+          </w:p>
+        </w:tc>
+        <w:tc>
+          <w:tcPr>
+            <w:tcW w:type="dxa" w:w="3120"/>
+            <w:shd w:fill="EAF1FB" w:val="clear"/>
+            <w:tcMar>
+              <w:top w:type="dxa" w:w="120"/>
+              <w:left w:type="dxa" w:w="90"/>
+              <w:bottom w:type="dxa" w:w="120"/>
+              <w:right w:type="dxa" w:w="90"/>
+            </w:tcMar>
+          </w:tcPr>
+          <w:p>
+            <w:pPr>
+              <w:spacing w:after="20"/>
+              <w:jc w:val="center"/>
+            </w:pPr>
+            <w:r>
+              <w:rPr>
+                <w:b/>
+                <w:bCs/>
+                <w:color w:val="1F3864"/>
+                <w:sz w:val="22"/>
+                <w:szCs w:val="22"/>
+              </w:rPr>
+              <w:t xml:space="preserve">Year 2</w:t>
+            </w:r>
+          </w:p>
+          <w:p>
+            <w:pPr>
+              <w:spacing w:after="20"/>
+              <w:jc w:val="center"/>
+            </w:pPr>
+            <w:r>
+              <w:rPr>
+                <w:b/>
+                <w:bCs/>
+                <w:color w:val="2E74B5"/>
+                <w:sz w:val="30"/>
+                <w:szCs w:val="30"/>
+              </w:rPr>
+              <w:t xml:space="preserve">2,000</w:t>
+            </w:r>
+          </w:p>
+          <w:p>
+            <w:pPr>
+              <w:jc w:val="center"/>
+            </w:pPr>
+            <w:r>
+              <w:rPr>
+                <w:color w:val="555555"/>
+                <w:sz w:val="16"/>
+                <w:szCs w:val="16"/>
+              </w:rPr>
+              <w:t xml:space="preserve">clients · ~$1.75M ARR — land PM companies (channel)</w:t>
+            </w:r>
+          </w:p>
+        </w:tc>
+        <w:tc>
+          <w:tcPr>
+            <w:tcW w:type="dxa" w:w="3120"/>
+            <w:shd w:fill="E2EFDA" w:val="clear"/>
+            <w:tcMar>
+              <w:top w:type="dxa" w:w="120"/>
+              <w:left w:type="dxa" w:w="90"/>
+              <w:bottom w:type="dxa" w:w="120"/>
+              <w:right w:type="dxa" w:w="90"/>
+            </w:tcMar>
+          </w:tcPr>
+          <w:p>
+            <w:pPr>
+              <w:spacing w:after="20"/>
+              <w:jc w:val="center"/>
+            </w:pPr>
+            <w:r>
+              <w:rPr>
+                <w:b/>
+                <w:bCs/>
+                <w:color w:val="1F3864"/>
+                <w:sz w:val="22"/>
+                <w:szCs w:val="22"/>
+              </w:rPr>
+              <w:t xml:space="preserve">Year 3</w:t>
+            </w:r>
+          </w:p>
+          <w:p>
+            <w:pPr>
+              <w:spacing w:after="20"/>
+              <w:jc w:val="center"/>
+            </w:pPr>
+            <w:r>
+              <w:rPr>
+                <w:b/>
+                <w:bCs/>
+                <w:color w:val="2E74B5"/>
+                <w:sz w:val="30"/>
+                <w:szCs w:val="30"/>
+              </w:rPr>
+              <w:t xml:space="preserve">5,050</w:t>
+            </w:r>
+          </w:p>
+          <w:p>
+            <w:pPr>
+              <w:jc w:val="center"/>
+            </w:pPr>
+            <w:r>
+              <w:rPr>
+                <w:color w:val="555555"/>
+                <w:sz w:val="16"/>
+                <w:szCs w:val="16"/>
+              </w:rPr>
+              <w:t xml:space="preserve">clients · ~$4.4M ARR — paid scale + flywheel</w:t>
+            </w:r>
+          </w:p>
+        </w:tc>
+      </w:tr>
+    </w:tbl>
+    <w:p>
+      <w:pPr>
+        <w:spacing w:after="60" w:before="180"/>
       </w:pPr>
       <w:r>
         <w:rPr>
           <w:b/>
           <w:bCs/>
-          <w:color w:val="999999"/>
-          <w:sz w:val="18"/>
-          <w:szCs w:val="18"/>
-        </w:rPr>
-        <w:t xml:space="preserve">CONFIDENTIAL</w:t>
+          <w:caps/>
+          <w:color w:val="1F3864"/>
+          <w:sz w:val="20"/>
+          <w:szCs w:val="20"/>
+        </w:rPr>
+        <w:t xml:space="preserve">Why It Works</w:t>
+      </w:r>
+    </w:p>
+    <w:p>
+      <w:pPr>
+        <w:spacing w:after="40"/>
+      </w:pPr>
+      <w:r>
+        <w:rPr>
+          <w:sz w:val="21"/>
+          <w:szCs w:val="21"/>
+        </w:rPr>
+        <w:t xml:space="preserve">Under-5-unit owners are the profit center — biggest, most profitable-per-unit segment. Large property managers are priced aggressively on purpose: they are a distribution channel whose adoption and referrals make the small, high-margin owners cheaper and easier to land.</w:t>
       </w:r>
     </w:p>
     <w:p>

</xml_diff>